<commit_message>
Add 10 multi-payment test cases and regenerate examples
New test cases TC-MULTI-001 through TC-MULTI-010:
- 6 single-PmtInf with TxCount 2-3 (SEPA, QR, IBAN, CBPR+)
  - 2 NOK cases: BR-SEPA-004 (name too long), BR-QR-003 (SCOR on QR)
- 2 multi-PmtInf groups (BATCH-A, BATCH-B), each with 2 PmtInf
  and TxCount=2 per PmtInf, mixing payment types

All 20 test cases pass. Multi-payment XMLs XSD-validated:
- BATCH-A: 2 PmtInf (SEPA+IBAN), 4 transactions, CtrlSum=13000
- BATCH-B: 2 PmtInf (CBPR++SEPA), 4 transactions, CtrlSum=32500

Co-Authored-By: Claude Opus 4.6 (1M context) <noreply@anthropic.com>
</commit_message>
<xml_diff>
--- a/examples/Testlauf_Zusammenfassung.docx
+++ b/examples/Testlauf_Zusammenfassung.docx
@@ -12,7 +12,7 @@
     </w:p>
     <w:p>
       <w:r>
-        <w:t>Datum/Uhrzeit: 2026-03-20 16:00:02</w:t>
+        <w:t>Datum/Uhrzeit: 2026-03-20 19:23:54</w:t>
       </w:r>
     </w:p>
     <w:p>
@@ -22,12 +22,12 @@
     </w:p>
     <w:p>
       <w:r>
-        <w:t>Testfälle gesamt: 10</w:t>
+        <w:t>Testfälle gesamt: 20</w:t>
       </w:r>
     </w:p>
     <w:p>
       <w:r>
-        <w:t>Pass: 10 | Fail: 0</w:t>
+        <w:t>Pass: 20 | Fail: 0</w:t>
       </w:r>
     </w:p>
     <w:p>
@@ -859,6 +859,734 @@
           </w:p>
         </w:tc>
       </w:tr>
+      <w:tr>
+        <w:tc>
+          <w:tcPr>
+            <w:tcW w:type="dxa" w:w="1234"/>
+          </w:tcPr>
+          <w:p>
+            <w:r>
+              <w:t>TC-MULTI-001</w:t>
+            </w:r>
+          </w:p>
+        </w:tc>
+        <w:tc>
+          <w:tcPr>
+            <w:tcW w:type="dxa" w:w="1234"/>
+          </w:tcPr>
+          <w:p>
+            <w:r>
+              <w:t>SEPA Sammelzahlung 3 Tx</w:t>
+            </w:r>
+          </w:p>
+        </w:tc>
+        <w:tc>
+          <w:tcPr>
+            <w:tcW w:type="dxa" w:w="1234"/>
+          </w:tcPr>
+          <w:p>
+            <w:r>
+              <w:t>SEPA</w:t>
+            </w:r>
+          </w:p>
+        </w:tc>
+        <w:tc>
+          <w:tcPr>
+            <w:tcW w:type="dxa" w:w="1234"/>
+          </w:tcPr>
+          <w:p>
+            <w:r>
+              <w:t>OK</w:t>
+            </w:r>
+          </w:p>
+        </w:tc>
+        <w:tc>
+          <w:tcPr>
+            <w:tcW w:type="dxa" w:w="1234"/>
+          </w:tcPr>
+          <w:p>
+            <w:r>
+              <w:t>Alle bestanden</w:t>
+            </w:r>
+          </w:p>
+        </w:tc>
+        <w:tc>
+          <w:tcPr>
+            <w:tcW w:type="dxa" w:w="1234"/>
+          </w:tcPr>
+          <w:p>
+            <w:r>
+              <w:t>Pass</w:t>
+            </w:r>
+          </w:p>
+        </w:tc>
+        <w:tc>
+          <w:tcPr>
+            <w:tcW w:type="dxa" w:w="1234"/>
+          </w:tcPr>
+          <w:p>
+            <w:r>
+              <w:t>1 B-Level, 3 C-Levels</w:t>
+            </w:r>
+          </w:p>
+        </w:tc>
+      </w:tr>
+      <w:tr>
+        <w:tc>
+          <w:tcPr>
+            <w:tcW w:type="dxa" w:w="1234"/>
+          </w:tcPr>
+          <w:p>
+            <w:r>
+              <w:t>TC-MULTI-002</w:t>
+            </w:r>
+          </w:p>
+        </w:tc>
+        <w:tc>
+          <w:tcPr>
+            <w:tcW w:type="dxa" w:w="1234"/>
+          </w:tcPr>
+          <w:p>
+            <w:r>
+              <w:t>QR-Sammelzahlung 2 Tx</w:t>
+            </w:r>
+          </w:p>
+        </w:tc>
+        <w:tc>
+          <w:tcPr>
+            <w:tcW w:type="dxa" w:w="1234"/>
+          </w:tcPr>
+          <w:p>
+            <w:r>
+              <w:t>Domestic-QR</w:t>
+            </w:r>
+          </w:p>
+        </w:tc>
+        <w:tc>
+          <w:tcPr>
+            <w:tcW w:type="dxa" w:w="1234"/>
+          </w:tcPr>
+          <w:p>
+            <w:r>
+              <w:t>OK</w:t>
+            </w:r>
+          </w:p>
+        </w:tc>
+        <w:tc>
+          <w:tcPr>
+            <w:tcW w:type="dxa" w:w="1234"/>
+          </w:tcPr>
+          <w:p>
+            <w:r>
+              <w:t>Alle bestanden</w:t>
+            </w:r>
+          </w:p>
+        </w:tc>
+        <w:tc>
+          <w:tcPr>
+            <w:tcW w:type="dxa" w:w="1234"/>
+          </w:tcPr>
+          <w:p>
+            <w:r>
+              <w:t>Pass</w:t>
+            </w:r>
+          </w:p>
+        </w:tc>
+        <w:tc>
+          <w:tcPr>
+            <w:tcW w:type="dxa" w:w="1234"/>
+          </w:tcPr>
+          <w:p>
+            <w:r>
+              <w:t>1 B-Level, 2 C-Levels</w:t>
+            </w:r>
+          </w:p>
+        </w:tc>
+      </w:tr>
+      <w:tr>
+        <w:tc>
+          <w:tcPr>
+            <w:tcW w:type="dxa" w:w="1234"/>
+          </w:tcPr>
+          <w:p>
+            <w:r>
+              <w:t>TC-MULTI-003</w:t>
+            </w:r>
+          </w:p>
+        </w:tc>
+        <w:tc>
+          <w:tcPr>
+            <w:tcW w:type="dxa" w:w="1234"/>
+          </w:tcPr>
+          <w:p>
+            <w:r>
+              <w:t>Domestic-IBAN Sammelzahlung 2 Tx</w:t>
+            </w:r>
+          </w:p>
+        </w:tc>
+        <w:tc>
+          <w:tcPr>
+            <w:tcW w:type="dxa" w:w="1234"/>
+          </w:tcPr>
+          <w:p>
+            <w:r>
+              <w:t>Domestic-IBAN</w:t>
+            </w:r>
+          </w:p>
+        </w:tc>
+        <w:tc>
+          <w:tcPr>
+            <w:tcW w:type="dxa" w:w="1234"/>
+          </w:tcPr>
+          <w:p>
+            <w:r>
+              <w:t>OK</w:t>
+            </w:r>
+          </w:p>
+        </w:tc>
+        <w:tc>
+          <w:tcPr>
+            <w:tcW w:type="dxa" w:w="1234"/>
+          </w:tcPr>
+          <w:p>
+            <w:r>
+              <w:t>Alle bestanden</w:t>
+            </w:r>
+          </w:p>
+        </w:tc>
+        <w:tc>
+          <w:tcPr>
+            <w:tcW w:type="dxa" w:w="1234"/>
+          </w:tcPr>
+          <w:p>
+            <w:r>
+              <w:t>Pass</w:t>
+            </w:r>
+          </w:p>
+        </w:tc>
+        <w:tc>
+          <w:tcPr>
+            <w:tcW w:type="dxa" w:w="1234"/>
+          </w:tcPr>
+          <w:p>
+            <w:r>
+              <w:t>1 B-Level, 2 C-Levels</w:t>
+            </w:r>
+          </w:p>
+        </w:tc>
+      </w:tr>
+      <w:tr>
+        <w:tc>
+          <w:tcPr>
+            <w:tcW w:type="dxa" w:w="1234"/>
+          </w:tcPr>
+          <w:p>
+            <w:r>
+              <w:t>TC-MULTI-004</w:t>
+            </w:r>
+          </w:p>
+        </w:tc>
+        <w:tc>
+          <w:tcPr>
+            <w:tcW w:type="dxa" w:w="1234"/>
+          </w:tcPr>
+          <w:p>
+            <w:r>
+              <w:t>CBPR+ Sammelzahlung 2 Tx</w:t>
+            </w:r>
+          </w:p>
+        </w:tc>
+        <w:tc>
+          <w:tcPr>
+            <w:tcW w:type="dxa" w:w="1234"/>
+          </w:tcPr>
+          <w:p>
+            <w:r>
+              <w:t>CBPR+</w:t>
+            </w:r>
+          </w:p>
+        </w:tc>
+        <w:tc>
+          <w:tcPr>
+            <w:tcW w:type="dxa" w:w="1234"/>
+          </w:tcPr>
+          <w:p>
+            <w:r>
+              <w:t>OK</w:t>
+            </w:r>
+          </w:p>
+        </w:tc>
+        <w:tc>
+          <w:tcPr>
+            <w:tcW w:type="dxa" w:w="1234"/>
+          </w:tcPr>
+          <w:p>
+            <w:r>
+              <w:t>Alle bestanden</w:t>
+            </w:r>
+          </w:p>
+        </w:tc>
+        <w:tc>
+          <w:tcPr>
+            <w:tcW w:type="dxa" w:w="1234"/>
+          </w:tcPr>
+          <w:p>
+            <w:r>
+              <w:t>Pass</w:t>
+            </w:r>
+          </w:p>
+        </w:tc>
+        <w:tc>
+          <w:tcPr>
+            <w:tcW w:type="dxa" w:w="1234"/>
+          </w:tcPr>
+          <w:p>
+            <w:r>
+              <w:t>1 B-Level, 2 C-Levels</w:t>
+            </w:r>
+          </w:p>
+        </w:tc>
+      </w:tr>
+      <w:tr>
+        <w:tc>
+          <w:tcPr>
+            <w:tcW w:type="dxa" w:w="1234"/>
+          </w:tcPr>
+          <w:p>
+            <w:r>
+              <w:t>TC-MULTI-005</w:t>
+            </w:r>
+          </w:p>
+        </w:tc>
+        <w:tc>
+          <w:tcPr>
+            <w:tcW w:type="dxa" w:w="1234"/>
+          </w:tcPr>
+          <w:p>
+            <w:r>
+              <w:t>SEPA Sammelzahlung NOK Name</w:t>
+            </w:r>
+          </w:p>
+        </w:tc>
+        <w:tc>
+          <w:tcPr>
+            <w:tcW w:type="dxa" w:w="1234"/>
+          </w:tcPr>
+          <w:p>
+            <w:r>
+              <w:t>SEPA</w:t>
+            </w:r>
+          </w:p>
+        </w:tc>
+        <w:tc>
+          <w:tcPr>
+            <w:tcW w:type="dxa" w:w="1234"/>
+          </w:tcPr>
+          <w:p>
+            <w:r>
+              <w:t>OK</w:t>
+            </w:r>
+          </w:p>
+        </w:tc>
+        <w:tc>
+          <w:tcPr>
+            <w:tcW w:type="dxa" w:w="1234"/>
+          </w:tcPr>
+          <w:p>
+            <w:r>
+              <w:t>BR-SEPA-004: Creditor-Name darf maximal 70 Zeichen lang sein</w:t>
+              <w:br/>
+              <w:t>BR-SEPA-004: Creditor-Name darf maximal 70 Zeichen lang sein</w:t>
+            </w:r>
+          </w:p>
+        </w:tc>
+        <w:tc>
+          <w:tcPr>
+            <w:tcW w:type="dxa" w:w="1234"/>
+          </w:tcPr>
+          <w:p>
+            <w:r>
+              <w:t>Pass</w:t>
+            </w:r>
+          </w:p>
+        </w:tc>
+        <w:tc>
+          <w:tcPr>
+            <w:tcW w:type="dxa" w:w="1234"/>
+          </w:tcPr>
+          <w:p>
+            <w:r>
+              <w:t>Erwartet: BR-SEPA-004 verletzt bei allen Tx</w:t>
+            </w:r>
+          </w:p>
+        </w:tc>
+      </w:tr>
+      <w:tr>
+        <w:tc>
+          <w:tcPr>
+            <w:tcW w:type="dxa" w:w="1234"/>
+          </w:tcPr>
+          <w:p>
+            <w:r>
+              <w:t>TC-MULTI-006</w:t>
+            </w:r>
+          </w:p>
+        </w:tc>
+        <w:tc>
+          <w:tcPr>
+            <w:tcW w:type="dxa" w:w="1234"/>
+          </w:tcPr>
+          <w:p>
+            <w:r>
+              <w:t>QR-Sammelzahlung NOK SCOR</w:t>
+            </w:r>
+          </w:p>
+        </w:tc>
+        <w:tc>
+          <w:tcPr>
+            <w:tcW w:type="dxa" w:w="1234"/>
+          </w:tcPr>
+          <w:p>
+            <w:r>
+              <w:t>Domestic-QR</w:t>
+            </w:r>
+          </w:p>
+        </w:tc>
+        <w:tc>
+          <w:tcPr>
+            <w:tcW w:type="dxa" w:w="1234"/>
+          </w:tcPr>
+          <w:p>
+            <w:r>
+              <w:t>OK</w:t>
+            </w:r>
+          </w:p>
+        </w:tc>
+        <w:tc>
+          <w:tcPr>
+            <w:tcW w:type="dxa" w:w="1234"/>
+          </w:tcPr>
+          <w:p>
+            <w:r>
+              <w:t>BR-QR-002: Bei QR-IBAN muss eine QR-Referenz (QRR) vorhanden sein</w:t>
+              <w:br/>
+              <w:t>BR-QR-003: SCOR-Referenz ist bei QR-IBAN nicht zulässig</w:t>
+              <w:br/>
+              <w:t>BR-QR-002: Bei QR-IBAN muss eine QR-Referenz (QRR) vorhanden sein</w:t>
+              <w:br/>
+              <w:t>BR-QR-003: SCOR-Referenz ist bei QR-IBAN nicht zulässig</w:t>
+            </w:r>
+          </w:p>
+        </w:tc>
+        <w:tc>
+          <w:tcPr>
+            <w:tcW w:type="dxa" w:w="1234"/>
+          </w:tcPr>
+          <w:p>
+            <w:r>
+              <w:t>Pass</w:t>
+            </w:r>
+          </w:p>
+        </w:tc>
+        <w:tc>
+          <w:tcPr>
+            <w:tcW w:type="dxa" w:w="1234"/>
+          </w:tcPr>
+          <w:p>
+            <w:r>
+              <w:t>Erwartet: BR-QR-003 verletzt (SCOR bei QR-IBAN)</w:t>
+            </w:r>
+          </w:p>
+        </w:tc>
+      </w:tr>
+      <w:tr>
+        <w:tc>
+          <w:tcPr>
+            <w:tcW w:type="dxa" w:w="1234"/>
+          </w:tcPr>
+          <w:p>
+            <w:r>
+              <w:t>TC-MULTI-007</w:t>
+            </w:r>
+          </w:p>
+        </w:tc>
+        <w:tc>
+          <w:tcPr>
+            <w:tcW w:type="dxa" w:w="1234"/>
+          </w:tcPr>
+          <w:p>
+            <w:r>
+              <w:t>Batch-A: SEPA-Teil</w:t>
+            </w:r>
+          </w:p>
+        </w:tc>
+        <w:tc>
+          <w:tcPr>
+            <w:tcW w:type="dxa" w:w="1234"/>
+          </w:tcPr>
+          <w:p>
+            <w:r>
+              <w:t>SEPA</w:t>
+            </w:r>
+          </w:p>
+        </w:tc>
+        <w:tc>
+          <w:tcPr>
+            <w:tcW w:type="dxa" w:w="1234"/>
+          </w:tcPr>
+          <w:p>
+            <w:r>
+              <w:t>OK</w:t>
+            </w:r>
+          </w:p>
+        </w:tc>
+        <w:tc>
+          <w:tcPr>
+            <w:tcW w:type="dxa" w:w="1234"/>
+          </w:tcPr>
+          <w:p>
+            <w:r>
+              <w:t>Alle bestanden</w:t>
+            </w:r>
+          </w:p>
+        </w:tc>
+        <w:tc>
+          <w:tcPr>
+            <w:tcW w:type="dxa" w:w="1234"/>
+          </w:tcPr>
+          <w:p>
+            <w:r>
+              <w:t>Pass</w:t>
+            </w:r>
+          </w:p>
+        </w:tc>
+        <w:tc>
+          <w:tcPr>
+            <w:tcW w:type="dxa" w:w="1234"/>
+          </w:tcPr>
+          <w:p>
+            <w:r>
+              <w:t>Gruppe BATCH-A, PmtInf 1 von 2</w:t>
+            </w:r>
+          </w:p>
+        </w:tc>
+      </w:tr>
+      <w:tr>
+        <w:tc>
+          <w:tcPr>
+            <w:tcW w:type="dxa" w:w="1234"/>
+          </w:tcPr>
+          <w:p>
+            <w:r>
+              <w:t>TC-MULTI-008</w:t>
+            </w:r>
+          </w:p>
+        </w:tc>
+        <w:tc>
+          <w:tcPr>
+            <w:tcW w:type="dxa" w:w="1234"/>
+          </w:tcPr>
+          <w:p>
+            <w:r>
+              <w:t>Batch-A: Domestic-IBAN-Teil</w:t>
+            </w:r>
+          </w:p>
+        </w:tc>
+        <w:tc>
+          <w:tcPr>
+            <w:tcW w:type="dxa" w:w="1234"/>
+          </w:tcPr>
+          <w:p>
+            <w:r>
+              <w:t>Domestic-IBAN</w:t>
+            </w:r>
+          </w:p>
+        </w:tc>
+        <w:tc>
+          <w:tcPr>
+            <w:tcW w:type="dxa" w:w="1234"/>
+          </w:tcPr>
+          <w:p>
+            <w:r>
+              <w:t>OK</w:t>
+            </w:r>
+          </w:p>
+        </w:tc>
+        <w:tc>
+          <w:tcPr>
+            <w:tcW w:type="dxa" w:w="1234"/>
+          </w:tcPr>
+          <w:p>
+            <w:r>
+              <w:t>Alle bestanden</w:t>
+            </w:r>
+          </w:p>
+        </w:tc>
+        <w:tc>
+          <w:tcPr>
+            <w:tcW w:type="dxa" w:w="1234"/>
+          </w:tcPr>
+          <w:p>
+            <w:r>
+              <w:t>Pass</w:t>
+            </w:r>
+          </w:p>
+        </w:tc>
+        <w:tc>
+          <w:tcPr>
+            <w:tcW w:type="dxa" w:w="1234"/>
+          </w:tcPr>
+          <w:p>
+            <w:r>
+              <w:t>Gruppe BATCH-A, PmtInf 2 von 2</w:t>
+            </w:r>
+          </w:p>
+        </w:tc>
+      </w:tr>
+      <w:tr>
+        <w:tc>
+          <w:tcPr>
+            <w:tcW w:type="dxa" w:w="1234"/>
+          </w:tcPr>
+          <w:p>
+            <w:r>
+              <w:t>TC-MULTI-009</w:t>
+            </w:r>
+          </w:p>
+        </w:tc>
+        <w:tc>
+          <w:tcPr>
+            <w:tcW w:type="dxa" w:w="1234"/>
+          </w:tcPr>
+          <w:p>
+            <w:r>
+              <w:t>Batch-B: CBPR+-Teil</w:t>
+            </w:r>
+          </w:p>
+        </w:tc>
+        <w:tc>
+          <w:tcPr>
+            <w:tcW w:type="dxa" w:w="1234"/>
+          </w:tcPr>
+          <w:p>
+            <w:r>
+              <w:t>CBPR+</w:t>
+            </w:r>
+          </w:p>
+        </w:tc>
+        <w:tc>
+          <w:tcPr>
+            <w:tcW w:type="dxa" w:w="1234"/>
+          </w:tcPr>
+          <w:p>
+            <w:r>
+              <w:t>OK</w:t>
+            </w:r>
+          </w:p>
+        </w:tc>
+        <w:tc>
+          <w:tcPr>
+            <w:tcW w:type="dxa" w:w="1234"/>
+          </w:tcPr>
+          <w:p>
+            <w:r>
+              <w:t>Alle bestanden</w:t>
+            </w:r>
+          </w:p>
+        </w:tc>
+        <w:tc>
+          <w:tcPr>
+            <w:tcW w:type="dxa" w:w="1234"/>
+          </w:tcPr>
+          <w:p>
+            <w:r>
+              <w:t>Pass</w:t>
+            </w:r>
+          </w:p>
+        </w:tc>
+        <w:tc>
+          <w:tcPr>
+            <w:tcW w:type="dxa" w:w="1234"/>
+          </w:tcPr>
+          <w:p>
+            <w:r>
+              <w:t>Gruppe BATCH-B, PmtInf 1 von 2</w:t>
+            </w:r>
+          </w:p>
+        </w:tc>
+      </w:tr>
+      <w:tr>
+        <w:tc>
+          <w:tcPr>
+            <w:tcW w:type="dxa" w:w="1234"/>
+          </w:tcPr>
+          <w:p>
+            <w:r>
+              <w:t>TC-MULTI-010</w:t>
+            </w:r>
+          </w:p>
+        </w:tc>
+        <w:tc>
+          <w:tcPr>
+            <w:tcW w:type="dxa" w:w="1234"/>
+          </w:tcPr>
+          <w:p>
+            <w:r>
+              <w:t>Batch-B: SEPA-Teil</w:t>
+            </w:r>
+          </w:p>
+        </w:tc>
+        <w:tc>
+          <w:tcPr>
+            <w:tcW w:type="dxa" w:w="1234"/>
+          </w:tcPr>
+          <w:p>
+            <w:r>
+              <w:t>SEPA</w:t>
+            </w:r>
+          </w:p>
+        </w:tc>
+        <w:tc>
+          <w:tcPr>
+            <w:tcW w:type="dxa" w:w="1234"/>
+          </w:tcPr>
+          <w:p>
+            <w:r>
+              <w:t>OK</w:t>
+            </w:r>
+          </w:p>
+        </w:tc>
+        <w:tc>
+          <w:tcPr>
+            <w:tcW w:type="dxa" w:w="1234"/>
+          </w:tcPr>
+          <w:p>
+            <w:r>
+              <w:t>Alle bestanden</w:t>
+            </w:r>
+          </w:p>
+        </w:tc>
+        <w:tc>
+          <w:tcPr>
+            <w:tcW w:type="dxa" w:w="1234"/>
+          </w:tcPr>
+          <w:p>
+            <w:r>
+              <w:t>Pass</w:t>
+            </w:r>
+          </w:p>
+        </w:tc>
+        <w:tc>
+          <w:tcPr>
+            <w:tcW w:type="dxa" w:w="1234"/>
+          </w:tcPr>
+          <w:p>
+            <w:r>
+              <w:t>Gruppe BATCH-B, PmtInf 2 von 2</w:t>
+            </w:r>
+          </w:p>
+        </w:tc>
+      </w:tr>
     </w:tbl>
     <w:sectPr>
       <w:pgSz w:w="12240" w:h="15840"/>

</xml_diff>

<commit_message>
Regenerate examples with all 65 test cases (36 business rules)
Co-Authored-By: Claude Opus 4.6 (1M context) <noreply@anthropic.com>
</commit_message>
<xml_diff>
--- a/examples/Testlauf_Zusammenfassung.docx
+++ b/examples/Testlauf_Zusammenfassung.docx
@@ -12,7 +12,7 @@
     </w:p>
     <w:p>
       <w:r>
-        <w:t>Datum/Uhrzeit: 2026-03-20 19:23:54</w:t>
+        <w:t>Datum/Uhrzeit: 2026-03-21 10:50:44</w:t>
       </w:r>
     </w:p>
     <w:p>
@@ -22,12 +22,12 @@
     </w:p>
     <w:p>
       <w:r>
-        <w:t>Testfälle gesamt: 20</w:t>
+        <w:t>Testfälle gesamt: 65</w:t>
       </w:r>
     </w:p>
     <w:p>
       <w:r>
-        <w:t>Pass: 20 | Fail: 0</w:t>
+        <w:t>Pass: 65 | Fail: 0</w:t>
       </w:r>
     </w:p>
     <w:p>
@@ -1306,17 +1306,17 @@
           </w:tcPr>
           <w:p>
             <w:r>
-              <w:t>TC-MULTI-007</w:t>
-            </w:r>
-          </w:p>
-        </w:tc>
-        <w:tc>
-          <w:tcPr>
-            <w:tcW w:type="dxa" w:w="1234"/>
-          </w:tcPr>
-          <w:p>
-            <w:r>
-              <w:t>Batch-A: SEPA-Teil</w:t>
+              <w:t>TC-SEPA-004</w:t>
+            </w:r>
+          </w:p>
+        </w:tc>
+        <w:tc>
+          <w:tcPr>
+            <w:tcW w:type="dxa" w:w="1234"/>
+          </w:tcPr>
+          <w:p>
+            <w:r>
+              <w:t>SEPA falsche Gebuehrenregelung</w:t>
             </w:r>
           </w:p>
         </w:tc>
@@ -1346,7 +1346,7 @@
           </w:tcPr>
           <w:p>
             <w:r>
-              <w:t>Alle bestanden</w:t>
+              <w:t>BR-SEPA-003: ChrgBr muss SLEV sein</w:t>
             </w:r>
           </w:p>
         </w:tc>
@@ -1366,7 +1366,7 @@
           </w:tcPr>
           <w:p>
             <w:r>
-              <w:t>Gruppe BATCH-A, PmtInf 1 von 2</w:t>
+              <w:t>Erwartet: BR-SEPA-003 verletzt (ChrgBr != SLEV)</w:t>
             </w:r>
           </w:p>
         </w:tc>
@@ -1378,27 +1378,27 @@
           </w:tcPr>
           <w:p>
             <w:r>
-              <w:t>TC-MULTI-008</w:t>
-            </w:r>
-          </w:p>
-        </w:tc>
-        <w:tc>
-          <w:tcPr>
-            <w:tcW w:type="dxa" w:w="1234"/>
-          </w:tcPr>
-          <w:p>
-            <w:r>
-              <w:t>Batch-A: Domestic-IBAN-Teil</w:t>
-            </w:r>
-          </w:p>
-        </w:tc>
-        <w:tc>
-          <w:tcPr>
-            <w:tcW w:type="dxa" w:w="1234"/>
-          </w:tcPr>
-          <w:p>
-            <w:r>
-              <w:t>Domestic-IBAN</w:t>
+              <w:t>TC-SEPA-005</w:t>
+            </w:r>
+          </w:p>
+        </w:tc>
+        <w:tc>
+          <w:tcPr>
+            <w:tcW w:type="dxa" w:w="1234"/>
+          </w:tcPr>
+          <w:p>
+            <w:r>
+              <w:t>SEPA zu langer Creditor-Name</w:t>
+            </w:r>
+          </w:p>
+        </w:tc>
+        <w:tc>
+          <w:tcPr>
+            <w:tcW w:type="dxa" w:w="1234"/>
+          </w:tcPr>
+          <w:p>
+            <w:r>
+              <w:t>SEPA</w:t>
             </w:r>
           </w:p>
         </w:tc>
@@ -1418,7 +1418,7 @@
           </w:tcPr>
           <w:p>
             <w:r>
-              <w:t>Alle bestanden</w:t>
+              <w:t>BR-SEPA-004: Creditor-Name darf maximal 70 Zeichen lang sein</w:t>
             </w:r>
           </w:p>
         </w:tc>
@@ -1438,7 +1438,7 @@
           </w:tcPr>
           <w:p>
             <w:r>
-              <w:t>Gruppe BATCH-A, PmtInf 2 von 2</w:t>
+              <w:t>Erwartet: BR-SEPA-004 verletzt (Name &gt; 70 Zeichen)</w:t>
             </w:r>
           </w:p>
         </w:tc>
@@ -1450,27 +1450,27 @@
           </w:tcPr>
           <w:p>
             <w:r>
-              <w:t>TC-MULTI-009</w:t>
-            </w:r>
-          </w:p>
-        </w:tc>
-        <w:tc>
-          <w:tcPr>
-            <w:tcW w:type="dxa" w:w="1234"/>
-          </w:tcPr>
-          <w:p>
-            <w:r>
-              <w:t>Batch-B: CBPR+-Teil</w:t>
-            </w:r>
-          </w:p>
-        </w:tc>
-        <w:tc>
-          <w:tcPr>
-            <w:tcW w:type="dxa" w:w="1234"/>
-          </w:tcPr>
-          <w:p>
-            <w:r>
-              <w:t>CBPR+</w:t>
+              <w:t>TC-QR-003</w:t>
+            </w:r>
+          </w:p>
+        </w:tc>
+        <w:tc>
+          <w:tcPr>
+            <w:tcW w:type="dxa" w:w="1234"/>
+          </w:tcPr>
+          <w:p>
+            <w:r>
+              <w:t>QR-Zahlung falsche Waehrung</w:t>
+            </w:r>
+          </w:p>
+        </w:tc>
+        <w:tc>
+          <w:tcPr>
+            <w:tcW w:type="dxa" w:w="1234"/>
+          </w:tcPr>
+          <w:p>
+            <w:r>
+              <w:t>Domestic-QR</w:t>
             </w:r>
           </w:p>
         </w:tc>
@@ -1490,7 +1490,7 @@
           </w:tcPr>
           <w:p>
             <w:r>
-              <w:t>Alle bestanden</w:t>
+              <w:t>BR-QR-004: Währung muss CHF oder EUR sein</w:t>
             </w:r>
           </w:p>
         </w:tc>
@@ -1510,7 +1510,7 @@
           </w:tcPr>
           <w:p>
             <w:r>
-              <w:t>Gruppe BATCH-B, PmtInf 1 von 2</w:t>
+              <w:t>Erwartet: BR-QR-004 verletzt (Waehrung nicht CHF/EUR)</w:t>
             </w:r>
           </w:p>
         </w:tc>
@@ -1522,6 +1522,2684 @@
           </w:tcPr>
           <w:p>
             <w:r>
+              <w:t>TC-IBAN-003</w:t>
+            </w:r>
+          </w:p>
+        </w:tc>
+        <w:tc>
+          <w:tcPr>
+            <w:tcW w:type="dxa" w:w="1234"/>
+          </w:tcPr>
+          <w:p>
+            <w:r>
+              <w:t>Domestic-IBAN mit QR-IBAN</w:t>
+            </w:r>
+          </w:p>
+        </w:tc>
+        <w:tc>
+          <w:tcPr>
+            <w:tcW w:type="dxa" w:w="1234"/>
+          </w:tcPr>
+          <w:p>
+            <w:r>
+              <w:t>Domestic-IBAN</w:t>
+            </w:r>
+          </w:p>
+        </w:tc>
+        <w:tc>
+          <w:tcPr>
+            <w:tcW w:type="dxa" w:w="1234"/>
+          </w:tcPr>
+          <w:p>
+            <w:r>
+              <w:t>OK</w:t>
+            </w:r>
+          </w:p>
+        </w:tc>
+        <w:tc>
+          <w:tcPr>
+            <w:tcW w:type="dxa" w:w="1234"/>
+          </w:tcPr>
+          <w:p>
+            <w:r>
+              <w:t>BR-IBAN-001: Creditor darf keine QR-IBAN haben</w:t>
+            </w:r>
+          </w:p>
+        </w:tc>
+        <w:tc>
+          <w:tcPr>
+            <w:tcW w:type="dxa" w:w="1234"/>
+          </w:tcPr>
+          <w:p>
+            <w:r>
+              <w:t>Pass</w:t>
+            </w:r>
+          </w:p>
+        </w:tc>
+        <w:tc>
+          <w:tcPr>
+            <w:tcW w:type="dxa" w:w="1234"/>
+          </w:tcPr>
+          <w:p>
+            <w:r>
+              <w:t>Erwartet: BR-IBAN-001 verletzt (QR-IBAN statt regulaere)</w:t>
+            </w:r>
+          </w:p>
+        </w:tc>
+      </w:tr>
+      <w:tr>
+        <w:tc>
+          <w:tcPr>
+            <w:tcW w:type="dxa" w:w="1234"/>
+          </w:tcPr>
+          <w:p>
+            <w:r>
+              <w:t>TC-IBAN-005</w:t>
+            </w:r>
+          </w:p>
+        </w:tc>
+        <w:tc>
+          <w:tcPr>
+            <w:tcW w:type="dxa" w:w="1234"/>
+          </w:tcPr>
+          <w:p>
+            <w:r>
+              <w:t>Domestic-IBAN mit QRR-Referenz</w:t>
+            </w:r>
+          </w:p>
+        </w:tc>
+        <w:tc>
+          <w:tcPr>
+            <w:tcW w:type="dxa" w:w="1234"/>
+          </w:tcPr>
+          <w:p>
+            <w:r>
+              <w:t>Domestic-IBAN</w:t>
+            </w:r>
+          </w:p>
+        </w:tc>
+        <w:tc>
+          <w:tcPr>
+            <w:tcW w:type="dxa" w:w="1234"/>
+          </w:tcPr>
+          <w:p>
+            <w:r>
+              <w:t>OK</w:t>
+            </w:r>
+          </w:p>
+        </w:tc>
+        <w:tc>
+          <w:tcPr>
+            <w:tcW w:type="dxa" w:w="1234"/>
+          </w:tcPr>
+          <w:p>
+            <w:r>
+              <w:t>BR-IBAN-002: QR-Referenz (QRR) ist bei regulärer IBAN nicht zulässig</w:t>
+            </w:r>
+          </w:p>
+        </w:tc>
+        <w:tc>
+          <w:tcPr>
+            <w:tcW w:type="dxa" w:w="1234"/>
+          </w:tcPr>
+          <w:p>
+            <w:r>
+              <w:t>Pass</w:t>
+            </w:r>
+          </w:p>
+        </w:tc>
+        <w:tc>
+          <w:tcPr>
+            <w:tcW w:type="dxa" w:w="1234"/>
+          </w:tcPr>
+          <w:p>
+            <w:r>
+              <w:t>Erwartet: BR-IBAN-002 verletzt (QRR bei regulaerer IBAN)</w:t>
+            </w:r>
+          </w:p>
+        </w:tc>
+      </w:tr>
+      <w:tr>
+        <w:tc>
+          <w:tcPr>
+            <w:tcW w:type="dxa" w:w="1234"/>
+          </w:tcPr>
+          <w:p>
+            <w:r>
+              <w:t>TC-SEPA-006</w:t>
+            </w:r>
+          </w:p>
+        </w:tc>
+        <w:tc>
+          <w:tcPr>
+            <w:tcW w:type="dxa" w:w="1234"/>
+          </w:tcPr>
+          <w:p>
+            <w:r>
+              <w:t>SEPA Kleinstbetrag</w:t>
+            </w:r>
+          </w:p>
+        </w:tc>
+        <w:tc>
+          <w:tcPr>
+            <w:tcW w:type="dxa" w:w="1234"/>
+          </w:tcPr>
+          <w:p>
+            <w:r>
+              <w:t>SEPA</w:t>
+            </w:r>
+          </w:p>
+        </w:tc>
+        <w:tc>
+          <w:tcPr>
+            <w:tcW w:type="dxa" w:w="1234"/>
+          </w:tcPr>
+          <w:p>
+            <w:r>
+              <w:t>OK</w:t>
+            </w:r>
+          </w:p>
+        </w:tc>
+        <w:tc>
+          <w:tcPr>
+            <w:tcW w:type="dxa" w:w="1234"/>
+          </w:tcPr>
+          <w:p>
+            <w:r>
+              <w:t>Alle bestanden</w:t>
+            </w:r>
+          </w:p>
+        </w:tc>
+        <w:tc>
+          <w:tcPr>
+            <w:tcW w:type="dxa" w:w="1234"/>
+          </w:tcPr>
+          <w:p>
+            <w:r>
+              <w:t>Pass</w:t>
+            </w:r>
+          </w:p>
+        </w:tc>
+        <w:tc>
+          <w:tcPr>
+            <w:tcW w:type="dxa" w:w="1234"/>
+          </w:tcPr>
+          <w:p>
+            <w:r>
+              <w:t>Grenzwert: kleinster zulaessiger Betrag</w:t>
+            </w:r>
+          </w:p>
+        </w:tc>
+      </w:tr>
+      <w:tr>
+        <w:tc>
+          <w:tcPr>
+            <w:tcW w:type="dxa" w:w="1234"/>
+          </w:tcPr>
+          <w:p>
+            <w:r>
+              <w:t>TC-SEPA-007</w:t>
+            </w:r>
+          </w:p>
+        </w:tc>
+        <w:tc>
+          <w:tcPr>
+            <w:tcW w:type="dxa" w:w="1234"/>
+          </w:tcPr>
+          <w:p>
+            <w:r>
+              <w:t>SEPA Grossbetrag</w:t>
+            </w:r>
+          </w:p>
+        </w:tc>
+        <w:tc>
+          <w:tcPr>
+            <w:tcW w:type="dxa" w:w="1234"/>
+          </w:tcPr>
+          <w:p>
+            <w:r>
+              <w:t>SEPA</w:t>
+            </w:r>
+          </w:p>
+        </w:tc>
+        <w:tc>
+          <w:tcPr>
+            <w:tcW w:type="dxa" w:w="1234"/>
+          </w:tcPr>
+          <w:p>
+            <w:r>
+              <w:t>OK</w:t>
+            </w:r>
+          </w:p>
+        </w:tc>
+        <w:tc>
+          <w:tcPr>
+            <w:tcW w:type="dxa" w:w="1234"/>
+          </w:tcPr>
+          <w:p>
+            <w:r>
+              <w:t>Alle bestanden</w:t>
+            </w:r>
+          </w:p>
+        </w:tc>
+        <w:tc>
+          <w:tcPr>
+            <w:tcW w:type="dxa" w:w="1234"/>
+          </w:tcPr>
+          <w:p>
+            <w:r>
+              <w:t>Pass</w:t>
+            </w:r>
+          </w:p>
+        </w:tc>
+        <w:tc>
+          <w:tcPr>
+            <w:tcW w:type="dxa" w:w="1234"/>
+          </w:tcPr>
+          <w:p>
+            <w:r>
+              <w:t>Hoher Betrag, innerhalb SEPA-Limit</w:t>
+            </w:r>
+          </w:p>
+        </w:tc>
+      </w:tr>
+      <w:tr>
+        <w:tc>
+          <w:tcPr>
+            <w:tcW w:type="dxa" w:w="1234"/>
+          </w:tcPr>
+          <w:p>
+            <w:r>
+              <w:t>TC-SEPA-008</w:t>
+            </w:r>
+          </w:p>
+        </w:tc>
+        <w:tc>
+          <w:tcPr>
+            <w:tcW w:type="dxa" w:w="1234"/>
+          </w:tcPr>
+          <w:p>
+            <w:r>
+              <w:t>SEPA Grenzwert Creditor-Name 70 Zeichen</w:t>
+            </w:r>
+          </w:p>
+        </w:tc>
+        <w:tc>
+          <w:tcPr>
+            <w:tcW w:type="dxa" w:w="1234"/>
+          </w:tcPr>
+          <w:p>
+            <w:r>
+              <w:t>SEPA</w:t>
+            </w:r>
+          </w:p>
+        </w:tc>
+        <w:tc>
+          <w:tcPr>
+            <w:tcW w:type="dxa" w:w="1234"/>
+          </w:tcPr>
+          <w:p>
+            <w:r>
+              <w:t>OK</w:t>
+            </w:r>
+          </w:p>
+        </w:tc>
+        <w:tc>
+          <w:tcPr>
+            <w:tcW w:type="dxa" w:w="1234"/>
+          </w:tcPr>
+          <w:p>
+            <w:r>
+              <w:t>Alle bestanden</w:t>
+            </w:r>
+          </w:p>
+        </w:tc>
+        <w:tc>
+          <w:tcPr>
+            <w:tcW w:type="dxa" w:w="1234"/>
+          </w:tcPr>
+          <w:p>
+            <w:r>
+              <w:t>Pass</w:t>
+            </w:r>
+          </w:p>
+        </w:tc>
+        <w:tc>
+          <w:tcPr>
+            <w:tcW w:type="dxa" w:w="1234"/>
+          </w:tcPr>
+          <w:p>
+            <w:r>
+              <w:t>Grenzwert: exakt 70 Zeichen, muss OK sein</w:t>
+            </w:r>
+          </w:p>
+        </w:tc>
+      </w:tr>
+      <w:tr>
+        <w:tc>
+          <w:tcPr>
+            <w:tcW w:type="dxa" w:w="1234"/>
+          </w:tcPr>
+          <w:p>
+            <w:r>
+              <w:t>TC-SEPA-009</w:t>
+            </w:r>
+          </w:p>
+        </w:tc>
+        <w:tc>
+          <w:tcPr>
+            <w:tcW w:type="dxa" w:w="1234"/>
+          </w:tcPr>
+          <w:p>
+            <w:r>
+              <w:t>SEPA mit vollem Creditor-Override</w:t>
+            </w:r>
+          </w:p>
+        </w:tc>
+        <w:tc>
+          <w:tcPr>
+            <w:tcW w:type="dxa" w:w="1234"/>
+          </w:tcPr>
+          <w:p>
+            <w:r>
+              <w:t>SEPA</w:t>
+            </w:r>
+          </w:p>
+        </w:tc>
+        <w:tc>
+          <w:tcPr>
+            <w:tcW w:type="dxa" w:w="1234"/>
+          </w:tcPr>
+          <w:p>
+            <w:r>
+              <w:t>OK</w:t>
+            </w:r>
+          </w:p>
+        </w:tc>
+        <w:tc>
+          <w:tcPr>
+            <w:tcW w:type="dxa" w:w="1234"/>
+          </w:tcPr>
+          <w:p>
+            <w:r>
+              <w:t>Alle bestanden</w:t>
+            </w:r>
+          </w:p>
+        </w:tc>
+        <w:tc>
+          <w:tcPr>
+            <w:tcW w:type="dxa" w:w="1234"/>
+          </w:tcPr>
+          <w:p>
+            <w:r>
+              <w:t>Pass</w:t>
+            </w:r>
+          </w:p>
+        </w:tc>
+        <w:tc>
+          <w:tcPr>
+            <w:tcW w:type="dxa" w:w="1234"/>
+          </w:tcPr>
+          <w:p>
+            <w:r>
+              <w:t>Alle Creditor-Felder uebersteuert</w:t>
+            </w:r>
+          </w:p>
+        </w:tc>
+      </w:tr>
+      <w:tr>
+        <w:tc>
+          <w:tcPr>
+            <w:tcW w:type="dxa" w:w="1234"/>
+          </w:tcPr>
+          <w:p>
+            <w:r>
+              <w:t>TC-SEPA-010</w:t>
+            </w:r>
+          </w:p>
+        </w:tc>
+        <w:tc>
+          <w:tcPr>
+            <w:tcW w:type="dxa" w:w="1234"/>
+          </w:tcPr>
+          <w:p>
+            <w:r>
+              <w:t>SEPA SEPA-Maxbetrag</w:t>
+            </w:r>
+          </w:p>
+        </w:tc>
+        <w:tc>
+          <w:tcPr>
+            <w:tcW w:type="dxa" w:w="1234"/>
+          </w:tcPr>
+          <w:p>
+            <w:r>
+              <w:t>SEPA</w:t>
+            </w:r>
+          </w:p>
+        </w:tc>
+        <w:tc>
+          <w:tcPr>
+            <w:tcW w:type="dxa" w:w="1234"/>
+          </w:tcPr>
+          <w:p>
+            <w:r>
+              <w:t>OK</w:t>
+            </w:r>
+          </w:p>
+        </w:tc>
+        <w:tc>
+          <w:tcPr>
+            <w:tcW w:type="dxa" w:w="1234"/>
+          </w:tcPr>
+          <w:p>
+            <w:r>
+              <w:t>Alle bestanden</w:t>
+            </w:r>
+          </w:p>
+        </w:tc>
+        <w:tc>
+          <w:tcPr>
+            <w:tcW w:type="dxa" w:w="1234"/>
+          </w:tcPr>
+          <w:p>
+            <w:r>
+              <w:t>Pass</w:t>
+            </w:r>
+          </w:p>
+        </w:tc>
+        <w:tc>
+          <w:tcPr>
+            <w:tcW w:type="dxa" w:w="1234"/>
+          </w:tcPr>
+          <w:p>
+            <w:r>
+              <w:t>Grenzwert: SEPA-Maximum (BR-SEPA-006)</w:t>
+            </w:r>
+          </w:p>
+        </w:tc>
+      </w:tr>
+      <w:tr>
+        <w:tc>
+          <w:tcPr>
+            <w:tcW w:type="dxa" w:w="1234"/>
+          </w:tcPr>
+          <w:p>
+            <w:r>
+              <w:t>TC-QR-004</w:t>
+            </w:r>
+          </w:p>
+        </w:tc>
+        <w:tc>
+          <w:tcPr>
+            <w:tcW w:type="dxa" w:w="1234"/>
+          </w:tcPr>
+          <w:p>
+            <w:r>
+              <w:t>QR-Zahlung EUR</w:t>
+            </w:r>
+          </w:p>
+        </w:tc>
+        <w:tc>
+          <w:tcPr>
+            <w:tcW w:type="dxa" w:w="1234"/>
+          </w:tcPr>
+          <w:p>
+            <w:r>
+              <w:t>Domestic-QR</w:t>
+            </w:r>
+          </w:p>
+        </w:tc>
+        <w:tc>
+          <w:tcPr>
+            <w:tcW w:type="dxa" w:w="1234"/>
+          </w:tcPr>
+          <w:p>
+            <w:r>
+              <w:t>OK</w:t>
+            </w:r>
+          </w:p>
+        </w:tc>
+        <w:tc>
+          <w:tcPr>
+            <w:tcW w:type="dxa" w:w="1234"/>
+          </w:tcPr>
+          <w:p>
+            <w:r>
+              <w:t>Alle bestanden</w:t>
+            </w:r>
+          </w:p>
+        </w:tc>
+        <w:tc>
+          <w:tcPr>
+            <w:tcW w:type="dxa" w:w="1234"/>
+          </w:tcPr>
+          <w:p>
+            <w:r>
+              <w:t>Pass</w:t>
+            </w:r>
+          </w:p>
+        </w:tc>
+        <w:tc>
+          <w:tcPr>
+            <w:tcW w:type="dxa" w:w="1234"/>
+          </w:tcPr>
+          <w:p>
+            <w:r>
+              <w:t>QR-IBAN mit EUR statt CHF</w:t>
+            </w:r>
+          </w:p>
+        </w:tc>
+      </w:tr>
+      <w:tr>
+        <w:tc>
+          <w:tcPr>
+            <w:tcW w:type="dxa" w:w="1234"/>
+          </w:tcPr>
+          <w:p>
+            <w:r>
+              <w:t>TC-QR-005</w:t>
+            </w:r>
+          </w:p>
+        </w:tc>
+        <w:tc>
+          <w:tcPr>
+            <w:tcW w:type="dxa" w:w="1234"/>
+          </w:tcPr>
+          <w:p>
+            <w:r>
+              <w:t>QR-Zahlung Kleinstbetrag</w:t>
+            </w:r>
+          </w:p>
+        </w:tc>
+        <w:tc>
+          <w:tcPr>
+            <w:tcW w:type="dxa" w:w="1234"/>
+          </w:tcPr>
+          <w:p>
+            <w:r>
+              <w:t>Domestic-QR</w:t>
+            </w:r>
+          </w:p>
+        </w:tc>
+        <w:tc>
+          <w:tcPr>
+            <w:tcW w:type="dxa" w:w="1234"/>
+          </w:tcPr>
+          <w:p>
+            <w:r>
+              <w:t>OK</w:t>
+            </w:r>
+          </w:p>
+        </w:tc>
+        <w:tc>
+          <w:tcPr>
+            <w:tcW w:type="dxa" w:w="1234"/>
+          </w:tcPr>
+          <w:p>
+            <w:r>
+              <w:t>Alle bestanden</w:t>
+            </w:r>
+          </w:p>
+        </w:tc>
+        <w:tc>
+          <w:tcPr>
+            <w:tcW w:type="dxa" w:w="1234"/>
+          </w:tcPr>
+          <w:p>
+            <w:r>
+              <w:t>Pass</w:t>
+            </w:r>
+          </w:p>
+        </w:tc>
+        <w:tc>
+          <w:tcPr>
+            <w:tcW w:type="dxa" w:w="1234"/>
+          </w:tcPr>
+          <w:p>
+            <w:r>
+              <w:t>Grenzwert: kleinster zulaessiger Betrag</w:t>
+            </w:r>
+          </w:p>
+        </w:tc>
+      </w:tr>
+      <w:tr>
+        <w:tc>
+          <w:tcPr>
+            <w:tcW w:type="dxa" w:w="1234"/>
+          </w:tcPr>
+          <w:p>
+            <w:r>
+              <w:t>TC-IBAN-006</w:t>
+            </w:r>
+          </w:p>
+        </w:tc>
+        <w:tc>
+          <w:tcPr>
+            <w:tcW w:type="dxa" w:w="1234"/>
+          </w:tcPr>
+          <w:p>
+            <w:r>
+              <w:t>Domestic-IBAN Kleinstbetrag</w:t>
+            </w:r>
+          </w:p>
+        </w:tc>
+        <w:tc>
+          <w:tcPr>
+            <w:tcW w:type="dxa" w:w="1234"/>
+          </w:tcPr>
+          <w:p>
+            <w:r>
+              <w:t>Domestic-IBAN</w:t>
+            </w:r>
+          </w:p>
+        </w:tc>
+        <w:tc>
+          <w:tcPr>
+            <w:tcW w:type="dxa" w:w="1234"/>
+          </w:tcPr>
+          <w:p>
+            <w:r>
+              <w:t>OK</w:t>
+            </w:r>
+          </w:p>
+        </w:tc>
+        <w:tc>
+          <w:tcPr>
+            <w:tcW w:type="dxa" w:w="1234"/>
+          </w:tcPr>
+          <w:p>
+            <w:r>
+              <w:t>Alle bestanden</w:t>
+            </w:r>
+          </w:p>
+        </w:tc>
+        <w:tc>
+          <w:tcPr>
+            <w:tcW w:type="dxa" w:w="1234"/>
+          </w:tcPr>
+          <w:p>
+            <w:r>
+              <w:t>Pass</w:t>
+            </w:r>
+          </w:p>
+        </w:tc>
+        <w:tc>
+          <w:tcPr>
+            <w:tcW w:type="dxa" w:w="1234"/>
+          </w:tcPr>
+          <w:p>
+            <w:r>
+              <w:t>Kleiner CHF-Betrag</w:t>
+            </w:r>
+          </w:p>
+        </w:tc>
+      </w:tr>
+      <w:tr>
+        <w:tc>
+          <w:tcPr>
+            <w:tcW w:type="dxa" w:w="1234"/>
+          </w:tcPr>
+          <w:p>
+            <w:r>
+              <w:t>TC-IBAN-007</w:t>
+            </w:r>
+          </w:p>
+        </w:tc>
+        <w:tc>
+          <w:tcPr>
+            <w:tcW w:type="dxa" w:w="1234"/>
+          </w:tcPr>
+          <w:p>
+            <w:r>
+              <w:t>Domestic-IBAN Grossbetrag</w:t>
+            </w:r>
+          </w:p>
+        </w:tc>
+        <w:tc>
+          <w:tcPr>
+            <w:tcW w:type="dxa" w:w="1234"/>
+          </w:tcPr>
+          <w:p>
+            <w:r>
+              <w:t>Domestic-IBAN</w:t>
+            </w:r>
+          </w:p>
+        </w:tc>
+        <w:tc>
+          <w:tcPr>
+            <w:tcW w:type="dxa" w:w="1234"/>
+          </w:tcPr>
+          <w:p>
+            <w:r>
+              <w:t>OK</w:t>
+            </w:r>
+          </w:p>
+        </w:tc>
+        <w:tc>
+          <w:tcPr>
+            <w:tcW w:type="dxa" w:w="1234"/>
+          </w:tcPr>
+          <w:p>
+            <w:r>
+              <w:t>Alle bestanden</w:t>
+            </w:r>
+          </w:p>
+        </w:tc>
+        <w:tc>
+          <w:tcPr>
+            <w:tcW w:type="dxa" w:w="1234"/>
+          </w:tcPr>
+          <w:p>
+            <w:r>
+              <w:t>Pass</w:t>
+            </w:r>
+          </w:p>
+        </w:tc>
+        <w:tc>
+          <w:tcPr>
+            <w:tcW w:type="dxa" w:w="1234"/>
+          </w:tcPr>
+          <w:p>
+            <w:r>
+              <w:t>Grossbetrag Inland</w:t>
+            </w:r>
+          </w:p>
+        </w:tc>
+      </w:tr>
+      <w:tr>
+        <w:tc>
+          <w:tcPr>
+            <w:tcW w:type="dxa" w:w="1234"/>
+          </w:tcPr>
+          <w:p>
+            <w:r>
+              <w:t>TC-CBPR-004</w:t>
+            </w:r>
+          </w:p>
+        </w:tc>
+        <w:tc>
+          <w:tcPr>
+            <w:tcW w:type="dxa" w:w="1234"/>
+          </w:tcPr>
+          <w:p>
+            <w:r>
+              <w:t>CBPR+ EUR-Zahlung</w:t>
+            </w:r>
+          </w:p>
+        </w:tc>
+        <w:tc>
+          <w:tcPr>
+            <w:tcW w:type="dxa" w:w="1234"/>
+          </w:tcPr>
+          <w:p>
+            <w:r>
+              <w:t>CBPR+</w:t>
+            </w:r>
+          </w:p>
+        </w:tc>
+        <w:tc>
+          <w:tcPr>
+            <w:tcW w:type="dxa" w:w="1234"/>
+          </w:tcPr>
+          <w:p>
+            <w:r>
+              <w:t>OK</w:t>
+            </w:r>
+          </w:p>
+        </w:tc>
+        <w:tc>
+          <w:tcPr>
+            <w:tcW w:type="dxa" w:w="1234"/>
+          </w:tcPr>
+          <w:p>
+            <w:r>
+              <w:t>Alle bestanden</w:t>
+            </w:r>
+          </w:p>
+        </w:tc>
+        <w:tc>
+          <w:tcPr>
+            <w:tcW w:type="dxa" w:w="1234"/>
+          </w:tcPr>
+          <w:p>
+            <w:r>
+              <w:t>Pass</w:t>
+            </w:r>
+          </w:p>
+        </w:tc>
+        <w:tc>
+          <w:tcPr>
+            <w:tcW w:type="dxa" w:w="1234"/>
+          </w:tcPr>
+          <w:p>
+            <w:r>
+              <w:t>CBPR+ mit europaeischer Waehrung</w:t>
+            </w:r>
+          </w:p>
+        </w:tc>
+      </w:tr>
+      <w:tr>
+        <w:tc>
+          <w:tcPr>
+            <w:tcW w:type="dxa" w:w="1234"/>
+          </w:tcPr>
+          <w:p>
+            <w:r>
+              <w:t>TC-CBPR-005</w:t>
+            </w:r>
+          </w:p>
+        </w:tc>
+        <w:tc>
+          <w:tcPr>
+            <w:tcW w:type="dxa" w:w="1234"/>
+          </w:tcPr>
+          <w:p>
+            <w:r>
+              <w:t>CBPR+ GBP-Zahlung</w:t>
+            </w:r>
+          </w:p>
+        </w:tc>
+        <w:tc>
+          <w:tcPr>
+            <w:tcW w:type="dxa" w:w="1234"/>
+          </w:tcPr>
+          <w:p>
+            <w:r>
+              <w:t>CBPR+</w:t>
+            </w:r>
+          </w:p>
+        </w:tc>
+        <w:tc>
+          <w:tcPr>
+            <w:tcW w:type="dxa" w:w="1234"/>
+          </w:tcPr>
+          <w:p>
+            <w:r>
+              <w:t>OK</w:t>
+            </w:r>
+          </w:p>
+        </w:tc>
+        <w:tc>
+          <w:tcPr>
+            <w:tcW w:type="dxa" w:w="1234"/>
+          </w:tcPr>
+          <w:p>
+            <w:r>
+              <w:t>Alle bestanden</w:t>
+            </w:r>
+          </w:p>
+        </w:tc>
+        <w:tc>
+          <w:tcPr>
+            <w:tcW w:type="dxa" w:w="1234"/>
+          </w:tcPr>
+          <w:p>
+            <w:r>
+              <w:t>Pass</w:t>
+            </w:r>
+          </w:p>
+        </w:tc>
+        <w:tc>
+          <w:tcPr>
+            <w:tcW w:type="dxa" w:w="1234"/>
+          </w:tcPr>
+          <w:p>
+            <w:r>
+              <w:t>CBPR+ Pfund Sterling</w:t>
+            </w:r>
+          </w:p>
+        </w:tc>
+      </w:tr>
+      <w:tr>
+        <w:tc>
+          <w:tcPr>
+            <w:tcW w:type="dxa" w:w="1234"/>
+          </w:tcPr>
+          <w:p>
+            <w:r>
+              <w:t>TC-CBPR-006</w:t>
+            </w:r>
+          </w:p>
+        </w:tc>
+        <w:tc>
+          <w:tcPr>
+            <w:tcW w:type="dxa" w:w="1234"/>
+          </w:tcPr>
+          <w:p>
+            <w:r>
+              <w:t>CBPR+ CHF-Zahlung</w:t>
+            </w:r>
+          </w:p>
+        </w:tc>
+        <w:tc>
+          <w:tcPr>
+            <w:tcW w:type="dxa" w:w="1234"/>
+          </w:tcPr>
+          <w:p>
+            <w:r>
+              <w:t>CBPR+</w:t>
+            </w:r>
+          </w:p>
+        </w:tc>
+        <w:tc>
+          <w:tcPr>
+            <w:tcW w:type="dxa" w:w="1234"/>
+          </w:tcPr>
+          <w:p>
+            <w:r>
+              <w:t>OK</w:t>
+            </w:r>
+          </w:p>
+        </w:tc>
+        <w:tc>
+          <w:tcPr>
+            <w:tcW w:type="dxa" w:w="1234"/>
+          </w:tcPr>
+          <w:p>
+            <w:r>
+              <w:t>Alle bestanden</w:t>
+            </w:r>
+          </w:p>
+        </w:tc>
+        <w:tc>
+          <w:tcPr>
+            <w:tcW w:type="dxa" w:w="1234"/>
+          </w:tcPr>
+          <w:p>
+            <w:r>
+              <w:t>Pass</w:t>
+            </w:r>
+          </w:p>
+        </w:tc>
+        <w:tc>
+          <w:tcPr>
+            <w:tcW w:type="dxa" w:w="1234"/>
+          </w:tcPr>
+          <w:p>
+            <w:r>
+              <w:t>CBPR+ mit Schweizer Franken</w:t>
+            </w:r>
+          </w:p>
+        </w:tc>
+      </w:tr>
+      <w:tr>
+        <w:tc>
+          <w:tcPr>
+            <w:tcW w:type="dxa" w:w="1234"/>
+          </w:tcPr>
+          <w:p>
+            <w:r>
+              <w:t>TC-DBT-001</w:t>
+            </w:r>
+          </w:p>
+        </w:tc>
+        <w:tc>
+          <w:tcPr>
+            <w:tcW w:type="dxa" w:w="1234"/>
+          </w:tcPr>
+          <w:p>
+            <w:r>
+              <w:t>Minimaler Debtor</w:t>
+            </w:r>
+          </w:p>
+        </w:tc>
+        <w:tc>
+          <w:tcPr>
+            <w:tcW w:type="dxa" w:w="1234"/>
+          </w:tcPr>
+          <w:p>
+            <w:r>
+              <w:t>SEPA</w:t>
+            </w:r>
+          </w:p>
+        </w:tc>
+        <w:tc>
+          <w:tcPr>
+            <w:tcW w:type="dxa" w:w="1234"/>
+          </w:tcPr>
+          <w:p>
+            <w:r>
+              <w:t>OK</w:t>
+            </w:r>
+          </w:p>
+        </w:tc>
+        <w:tc>
+          <w:tcPr>
+            <w:tcW w:type="dxa" w:w="1234"/>
+          </w:tcPr>
+          <w:p>
+            <w:r>
+              <w:t>Alle bestanden</w:t>
+            </w:r>
+          </w:p>
+        </w:tc>
+        <w:tc>
+          <w:tcPr>
+            <w:tcW w:type="dxa" w:w="1234"/>
+          </w:tcPr>
+          <w:p>
+            <w:r>
+              <w:t>Pass</w:t>
+            </w:r>
+          </w:p>
+        </w:tc>
+        <w:tc>
+          <w:tcPr>
+            <w:tcW w:type="dxa" w:w="1234"/>
+          </w:tcPr>
+          <w:p>
+            <w:r>
+              <w:t>Debtor ohne BIC, Adresse — NOTPROVIDED im XML</w:t>
+            </w:r>
+          </w:p>
+        </w:tc>
+      </w:tr>
+      <w:tr>
+        <w:tc>
+          <w:tcPr>
+            <w:tcW w:type="dxa" w:w="1234"/>
+          </w:tcPr>
+          <w:p>
+            <w:r>
+              <w:t>TC-DBT-002</w:t>
+            </w:r>
+          </w:p>
+        </w:tc>
+        <w:tc>
+          <w:tcPr>
+            <w:tcW w:type="dxa" w:w="1234"/>
+          </w:tcPr>
+          <w:p>
+            <w:r>
+              <w:t>Alternativer Debtor</w:t>
+            </w:r>
+          </w:p>
+        </w:tc>
+        <w:tc>
+          <w:tcPr>
+            <w:tcW w:type="dxa" w:w="1234"/>
+          </w:tcPr>
+          <w:p>
+            <w:r>
+              <w:t>Domestic-QR</w:t>
+            </w:r>
+          </w:p>
+        </w:tc>
+        <w:tc>
+          <w:tcPr>
+            <w:tcW w:type="dxa" w:w="1234"/>
+          </w:tcPr>
+          <w:p>
+            <w:r>
+              <w:t>OK</w:t>
+            </w:r>
+          </w:p>
+        </w:tc>
+        <w:tc>
+          <w:tcPr>
+            <w:tcW w:type="dxa" w:w="1234"/>
+          </w:tcPr>
+          <w:p>
+            <w:r>
+              <w:t>Alle bestanden</w:t>
+            </w:r>
+          </w:p>
+        </w:tc>
+        <w:tc>
+          <w:tcPr>
+            <w:tcW w:type="dxa" w:w="1234"/>
+          </w:tcPr>
+          <w:p>
+            <w:r>
+              <w:t>Pass</w:t>
+            </w:r>
+          </w:p>
+        </w:tc>
+        <w:tc>
+          <w:tcPr>
+            <w:tcW w:type="dxa" w:w="1234"/>
+          </w:tcPr>
+          <w:p>
+            <w:r>
+              <w:t>Anderer Debtor (Helvetia)</w:t>
+            </w:r>
+          </w:p>
+        </w:tc>
+      </w:tr>
+      <w:tr>
+        <w:tc>
+          <w:tcPr>
+            <w:tcW w:type="dxa" w:w="1234"/>
+          </w:tcPr>
+          <w:p>
+            <w:r>
+              <w:t>TC-DBT-003</w:t>
+            </w:r>
+          </w:p>
+        </w:tc>
+        <w:tc>
+          <w:tcPr>
+            <w:tcW w:type="dxa" w:w="1234"/>
+          </w:tcPr>
+          <w:p>
+            <w:r>
+              <w:t>Alternativer Debtor Domestic</w:t>
+            </w:r>
+          </w:p>
+        </w:tc>
+        <w:tc>
+          <w:tcPr>
+            <w:tcW w:type="dxa" w:w="1234"/>
+          </w:tcPr>
+          <w:p>
+            <w:r>
+              <w:t>Domestic-IBAN</w:t>
+            </w:r>
+          </w:p>
+        </w:tc>
+        <w:tc>
+          <w:tcPr>
+            <w:tcW w:type="dxa" w:w="1234"/>
+          </w:tcPr>
+          <w:p>
+            <w:r>
+              <w:t>OK</w:t>
+            </w:r>
+          </w:p>
+        </w:tc>
+        <w:tc>
+          <w:tcPr>
+            <w:tcW w:type="dxa" w:w="1234"/>
+          </w:tcPr>
+          <w:p>
+            <w:r>
+              <w:t>Alle bestanden</w:t>
+            </w:r>
+          </w:p>
+        </w:tc>
+        <w:tc>
+          <w:tcPr>
+            <w:tcW w:type="dxa" w:w="1234"/>
+          </w:tcPr>
+          <w:p>
+            <w:r>
+              <w:t>Pass</w:t>
+            </w:r>
+          </w:p>
+        </w:tc>
+        <w:tc>
+          <w:tcPr>
+            <w:tcW w:type="dxa" w:w="1234"/>
+          </w:tcPr>
+          <w:p>
+            <w:r>
+              <w:t>Helvetia als Debtor bei Inlandszahlung</w:t>
+            </w:r>
+          </w:p>
+        </w:tc>
+      </w:tr>
+      <w:tr>
+        <w:tc>
+          <w:tcPr>
+            <w:tcW w:type="dxa" w:w="1234"/>
+          </w:tcPr>
+          <w:p>
+            <w:r>
+              <w:t>TC-NOK-001</w:t>
+            </w:r>
+          </w:p>
+        </w:tc>
+        <w:tc>
+          <w:tcPr>
+            <w:tcW w:type="dxa" w:w="1234"/>
+          </w:tcPr>
+          <w:p>
+            <w:r>
+              <w:t>SEPA 3 Tx falsche Waehrung</w:t>
+            </w:r>
+          </w:p>
+        </w:tc>
+        <w:tc>
+          <w:tcPr>
+            <w:tcW w:type="dxa" w:w="1234"/>
+          </w:tcPr>
+          <w:p>
+            <w:r>
+              <w:t>SEPA</w:t>
+            </w:r>
+          </w:p>
+        </w:tc>
+        <w:tc>
+          <w:tcPr>
+            <w:tcW w:type="dxa" w:w="1234"/>
+          </w:tcPr>
+          <w:p>
+            <w:r>
+              <w:t>OK</w:t>
+            </w:r>
+          </w:p>
+        </w:tc>
+        <w:tc>
+          <w:tcPr>
+            <w:tcW w:type="dxa" w:w="1234"/>
+          </w:tcPr>
+          <w:p>
+            <w:r>
+              <w:t>BR-SEPA-001: Währung muss EUR sein</w:t>
+              <w:br/>
+              <w:t>BR-SEPA-001: Währung muss EUR sein</w:t>
+              <w:br/>
+              <w:t>BR-SEPA-001: Währung muss EUR sein</w:t>
+            </w:r>
+          </w:p>
+        </w:tc>
+        <w:tc>
+          <w:tcPr>
+            <w:tcW w:type="dxa" w:w="1234"/>
+          </w:tcPr>
+          <w:p>
+            <w:r>
+              <w:t>Pass</w:t>
+            </w:r>
+          </w:p>
+        </w:tc>
+        <w:tc>
+          <w:tcPr>
+            <w:tcW w:type="dxa" w:w="1234"/>
+          </w:tcPr>
+          <w:p>
+            <w:r>
+              <w:t>BR-SEPA-001 bei allen 3 Transaktionen</w:t>
+            </w:r>
+          </w:p>
+        </w:tc>
+      </w:tr>
+      <w:tr>
+        <w:tc>
+          <w:tcPr>
+            <w:tcW w:type="dxa" w:w="1234"/>
+          </w:tcPr>
+          <w:p>
+            <w:r>
+              <w:t>TC-NOK-002</w:t>
+            </w:r>
+          </w:p>
+        </w:tc>
+        <w:tc>
+          <w:tcPr>
+            <w:tcW w:type="dxa" w:w="1234"/>
+          </w:tcPr>
+          <w:p>
+            <w:r>
+              <w:t>QR 3 Tx ohne Referenz</w:t>
+            </w:r>
+          </w:p>
+        </w:tc>
+        <w:tc>
+          <w:tcPr>
+            <w:tcW w:type="dxa" w:w="1234"/>
+          </w:tcPr>
+          <w:p>
+            <w:r>
+              <w:t>Domestic-QR</w:t>
+            </w:r>
+          </w:p>
+        </w:tc>
+        <w:tc>
+          <w:tcPr>
+            <w:tcW w:type="dxa" w:w="1234"/>
+          </w:tcPr>
+          <w:p>
+            <w:r>
+              <w:t>OK</w:t>
+            </w:r>
+          </w:p>
+        </w:tc>
+        <w:tc>
+          <w:tcPr>
+            <w:tcW w:type="dxa" w:w="1234"/>
+          </w:tcPr>
+          <w:p>
+            <w:r>
+              <w:t>BR-QR-002: Bei QR-IBAN muss eine QR-Referenz (QRR) vorhanden sein</w:t>
+              <w:br/>
+              <w:t>BR-QR-002: Bei QR-IBAN muss eine QR-Referenz (QRR) vorhanden sein</w:t>
+              <w:br/>
+              <w:t>BR-QR-002: Bei QR-IBAN muss eine QR-Referenz (QRR) vorhanden sein</w:t>
+            </w:r>
+          </w:p>
+        </w:tc>
+        <w:tc>
+          <w:tcPr>
+            <w:tcW w:type="dxa" w:w="1234"/>
+          </w:tcPr>
+          <w:p>
+            <w:r>
+              <w:t>Pass</w:t>
+            </w:r>
+          </w:p>
+        </w:tc>
+        <w:tc>
+          <w:tcPr>
+            <w:tcW w:type="dxa" w:w="1234"/>
+          </w:tcPr>
+          <w:p>
+            <w:r>
+              <w:t>BR-QR-002 bei allen 3 Transaktionen</w:t>
+            </w:r>
+          </w:p>
+        </w:tc>
+      </w:tr>
+      <w:tr>
+        <w:tc>
+          <w:tcPr>
+            <w:tcW w:type="dxa" w:w="1234"/>
+          </w:tcPr>
+          <w:p>
+            <w:r>
+              <w:t>TC-NOK-003</w:t>
+            </w:r>
+          </w:p>
+        </w:tc>
+        <w:tc>
+          <w:tcPr>
+            <w:tcW w:type="dxa" w:w="1234"/>
+          </w:tcPr>
+          <w:p>
+            <w:r>
+              <w:t>IBAN 2 Tx mit QR-IBAN</w:t>
+            </w:r>
+          </w:p>
+        </w:tc>
+        <w:tc>
+          <w:tcPr>
+            <w:tcW w:type="dxa" w:w="1234"/>
+          </w:tcPr>
+          <w:p>
+            <w:r>
+              <w:t>Domestic-IBAN</w:t>
+            </w:r>
+          </w:p>
+        </w:tc>
+        <w:tc>
+          <w:tcPr>
+            <w:tcW w:type="dxa" w:w="1234"/>
+          </w:tcPr>
+          <w:p>
+            <w:r>
+              <w:t>OK</w:t>
+            </w:r>
+          </w:p>
+        </w:tc>
+        <w:tc>
+          <w:tcPr>
+            <w:tcW w:type="dxa" w:w="1234"/>
+          </w:tcPr>
+          <w:p>
+            <w:r>
+              <w:t>BR-IBAN-001: Creditor darf keine QR-IBAN haben</w:t>
+              <w:br/>
+              <w:t>BR-IBAN-001: Creditor darf keine QR-IBAN haben</w:t>
+            </w:r>
+          </w:p>
+        </w:tc>
+        <w:tc>
+          <w:tcPr>
+            <w:tcW w:type="dxa" w:w="1234"/>
+          </w:tcPr>
+          <w:p>
+            <w:r>
+              <w:t>Pass</w:t>
+            </w:r>
+          </w:p>
+        </w:tc>
+        <w:tc>
+          <w:tcPr>
+            <w:tcW w:type="dxa" w:w="1234"/>
+          </w:tcPr>
+          <w:p>
+            <w:r>
+              <w:t>BR-IBAN-001 bei 2 Transaktionen</w:t>
+            </w:r>
+          </w:p>
+        </w:tc>
+      </w:tr>
+      <w:tr>
+        <w:tc>
+          <w:tcPr>
+            <w:tcW w:type="dxa" w:w="1234"/>
+          </w:tcPr>
+          <w:p>
+            <w:r>
+              <w:t>TC-NOK-004</w:t>
+            </w:r>
+          </w:p>
+        </w:tc>
+        <w:tc>
+          <w:tcPr>
+            <w:tcW w:type="dxa" w:w="1234"/>
+          </w:tcPr>
+          <w:p>
+            <w:r>
+              <w:t>CBPR+ 2 Tx ohne Agent</w:t>
+            </w:r>
+          </w:p>
+        </w:tc>
+        <w:tc>
+          <w:tcPr>
+            <w:tcW w:type="dxa" w:w="1234"/>
+          </w:tcPr>
+          <w:p>
+            <w:r>
+              <w:t>CBPR+</w:t>
+            </w:r>
+          </w:p>
+        </w:tc>
+        <w:tc>
+          <w:tcPr>
+            <w:tcW w:type="dxa" w:w="1234"/>
+          </w:tcPr>
+          <w:p>
+            <w:r>
+              <w:t>OK</w:t>
+            </w:r>
+          </w:p>
+        </w:tc>
+        <w:tc>
+          <w:tcPr>
+            <w:tcW w:type="dxa" w:w="1234"/>
+          </w:tcPr>
+          <w:p>
+            <w:r>
+              <w:t>BR-CBPR-005: Creditor-Agent (BIC) muss angegeben werden</w:t>
+              <w:br/>
+              <w:t>BR-CBPR-005: Creditor-Agent (BIC) muss angegeben werden</w:t>
+            </w:r>
+          </w:p>
+        </w:tc>
+        <w:tc>
+          <w:tcPr>
+            <w:tcW w:type="dxa" w:w="1234"/>
+          </w:tcPr>
+          <w:p>
+            <w:r>
+              <w:t>Pass</w:t>
+            </w:r>
+          </w:p>
+        </w:tc>
+        <w:tc>
+          <w:tcPr>
+            <w:tcW w:type="dxa" w:w="1234"/>
+          </w:tcPr>
+          <w:p>
+            <w:r>
+              <w:t>BR-CBPR-005 bei 2 Transaktionen</w:t>
+            </w:r>
+          </w:p>
+        </w:tc>
+      </w:tr>
+      <w:tr>
+        <w:tc>
+          <w:tcPr>
+            <w:tcW w:type="dxa" w:w="1234"/>
+          </w:tcPr>
+          <w:p>
+            <w:r>
+              <w:t>TC-NOK-005</w:t>
+            </w:r>
+          </w:p>
+        </w:tc>
+        <w:tc>
+          <w:tcPr>
+            <w:tcW w:type="dxa" w:w="1234"/>
+          </w:tcPr>
+          <w:p>
+            <w:r>
+              <w:t>IBAN 2 Tx mit QRR</w:t>
+            </w:r>
+          </w:p>
+        </w:tc>
+        <w:tc>
+          <w:tcPr>
+            <w:tcW w:type="dxa" w:w="1234"/>
+          </w:tcPr>
+          <w:p>
+            <w:r>
+              <w:t>Domestic-IBAN</w:t>
+            </w:r>
+          </w:p>
+        </w:tc>
+        <w:tc>
+          <w:tcPr>
+            <w:tcW w:type="dxa" w:w="1234"/>
+          </w:tcPr>
+          <w:p>
+            <w:r>
+              <w:t>OK</w:t>
+            </w:r>
+          </w:p>
+        </w:tc>
+        <w:tc>
+          <w:tcPr>
+            <w:tcW w:type="dxa" w:w="1234"/>
+          </w:tcPr>
+          <w:p>
+            <w:r>
+              <w:t>BR-IBAN-002: QR-Referenz (QRR) ist bei regulärer IBAN nicht zulässig</w:t>
+              <w:br/>
+              <w:t>BR-IBAN-002: QR-Referenz (QRR) ist bei regulärer IBAN nicht zulässig</w:t>
+            </w:r>
+          </w:p>
+        </w:tc>
+        <w:tc>
+          <w:tcPr>
+            <w:tcW w:type="dxa" w:w="1234"/>
+          </w:tcPr>
+          <w:p>
+            <w:r>
+              <w:t>Pass</w:t>
+            </w:r>
+          </w:p>
+        </w:tc>
+        <w:tc>
+          <w:tcPr>
+            <w:tcW w:type="dxa" w:w="1234"/>
+          </w:tcPr>
+          <w:p>
+            <w:r>
+              <w:t>BR-IBAN-002 bei 2 Transaktionen</w:t>
+            </w:r>
+          </w:p>
+        </w:tc>
+      </w:tr>
+      <w:tr>
+        <w:tc>
+          <w:tcPr>
+            <w:tcW w:type="dxa" w:w="1234"/>
+          </w:tcPr>
+          <w:p>
+            <w:r>
+              <w:t>TC-NOK-007</w:t>
+            </w:r>
+          </w:p>
+        </w:tc>
+        <w:tc>
+          <w:tcPr>
+            <w:tcW w:type="dxa" w:w="1234"/>
+          </w:tcPr>
+          <w:p>
+            <w:r>
+              <w:t>SEPA falsche Gebuehr anderer Debtor</w:t>
+            </w:r>
+          </w:p>
+        </w:tc>
+        <w:tc>
+          <w:tcPr>
+            <w:tcW w:type="dxa" w:w="1234"/>
+          </w:tcPr>
+          <w:p>
+            <w:r>
+              <w:t>SEPA</w:t>
+            </w:r>
+          </w:p>
+        </w:tc>
+        <w:tc>
+          <w:tcPr>
+            <w:tcW w:type="dxa" w:w="1234"/>
+          </w:tcPr>
+          <w:p>
+            <w:r>
+              <w:t>OK</w:t>
+            </w:r>
+          </w:p>
+        </w:tc>
+        <w:tc>
+          <w:tcPr>
+            <w:tcW w:type="dxa" w:w="1234"/>
+          </w:tcPr>
+          <w:p>
+            <w:r>
+              <w:t>BR-SEPA-003: ChrgBr muss SLEV sein</w:t>
+            </w:r>
+          </w:p>
+        </w:tc>
+        <w:tc>
+          <w:tcPr>
+            <w:tcW w:type="dxa" w:w="1234"/>
+          </w:tcPr>
+          <w:p>
+            <w:r>
+              <w:t>Pass</w:t>
+            </w:r>
+          </w:p>
+        </w:tc>
+        <w:tc>
+          <w:tcPr>
+            <w:tcW w:type="dxa" w:w="1234"/>
+          </w:tcPr>
+          <w:p>
+            <w:r>
+              <w:t>BR-SEPA-003 mit alternativem Debtor</w:t>
+            </w:r>
+          </w:p>
+        </w:tc>
+      </w:tr>
+      <w:tr>
+        <w:tc>
+          <w:tcPr>
+            <w:tcW w:type="dxa" w:w="1234"/>
+          </w:tcPr>
+          <w:p>
+            <w:r>
+              <w:t>TC-NOK-008</w:t>
+            </w:r>
+          </w:p>
+        </w:tc>
+        <w:tc>
+          <w:tcPr>
+            <w:tcW w:type="dxa" w:w="1234"/>
+          </w:tcPr>
+          <w:p>
+            <w:r>
+              <w:t>QR falsche Waehrung anderer Debtor</w:t>
+            </w:r>
+          </w:p>
+        </w:tc>
+        <w:tc>
+          <w:tcPr>
+            <w:tcW w:type="dxa" w:w="1234"/>
+          </w:tcPr>
+          <w:p>
+            <w:r>
+              <w:t>Domestic-QR</w:t>
+            </w:r>
+          </w:p>
+        </w:tc>
+        <w:tc>
+          <w:tcPr>
+            <w:tcW w:type="dxa" w:w="1234"/>
+          </w:tcPr>
+          <w:p>
+            <w:r>
+              <w:t>OK</w:t>
+            </w:r>
+          </w:p>
+        </w:tc>
+        <w:tc>
+          <w:tcPr>
+            <w:tcW w:type="dxa" w:w="1234"/>
+          </w:tcPr>
+          <w:p>
+            <w:r>
+              <w:t>BR-QR-004: Währung muss CHF oder EUR sein</w:t>
+            </w:r>
+          </w:p>
+        </w:tc>
+        <w:tc>
+          <w:tcPr>
+            <w:tcW w:type="dxa" w:w="1234"/>
+          </w:tcPr>
+          <w:p>
+            <w:r>
+              <w:t>Pass</w:t>
+            </w:r>
+          </w:p>
+        </w:tc>
+        <w:tc>
+          <w:tcPr>
+            <w:tcW w:type="dxa" w:w="1234"/>
+          </w:tcPr>
+          <w:p>
+            <w:r>
+              <w:t>BR-QR-004 mit alternativem Debtor</w:t>
+            </w:r>
+          </w:p>
+        </w:tc>
+      </w:tr>
+      <w:tr>
+        <w:tc>
+          <w:tcPr>
+            <w:tcW w:type="dxa" w:w="1234"/>
+          </w:tcPr>
+          <w:p>
+            <w:r>
+              <w:t>TC-VAL-001</w:t>
+            </w:r>
+          </w:p>
+        </w:tc>
+        <w:tc>
+          <w:tcPr>
+            <w:tcW w:type="dxa" w:w="1234"/>
+          </w:tcPr>
+          <w:p>
+            <w:r>
+              <w:t>Betrag mit 2 Dezimalstellen</w:t>
+            </w:r>
+          </w:p>
+        </w:tc>
+        <w:tc>
+          <w:tcPr>
+            <w:tcW w:type="dxa" w:w="1234"/>
+          </w:tcPr>
+          <w:p>
+            <w:r>
+              <w:t>SEPA</w:t>
+            </w:r>
+          </w:p>
+        </w:tc>
+        <w:tc>
+          <w:tcPr>
+            <w:tcW w:type="dxa" w:w="1234"/>
+          </w:tcPr>
+          <w:p>
+            <w:r>
+              <w:t>OK</w:t>
+            </w:r>
+          </w:p>
+        </w:tc>
+        <w:tc>
+          <w:tcPr>
+            <w:tcW w:type="dxa" w:w="1234"/>
+          </w:tcPr>
+          <w:p>
+            <w:r>
+              <w:t>Alle bestanden</w:t>
+            </w:r>
+          </w:p>
+        </w:tc>
+        <w:tc>
+          <w:tcPr>
+            <w:tcW w:type="dxa" w:w="1234"/>
+          </w:tcPr>
+          <w:p>
+            <w:r>
+              <w:t>Pass</w:t>
+            </w:r>
+          </w:p>
+        </w:tc>
+        <w:tc>
+          <w:tcPr>
+            <w:tcW w:type="dxa" w:w="1234"/>
+          </w:tcPr>
+          <w:p>
+            <w:r>
+              <w:t>BR-GEN-001: exakt 2 Dezimalstellen</w:t>
+            </w:r>
+          </w:p>
+        </w:tc>
+      </w:tr>
+      <w:tr>
+        <w:tc>
+          <w:tcPr>
+            <w:tcW w:type="dxa" w:w="1234"/>
+          </w:tcPr>
+          <w:p>
+            <w:r>
+              <w:t>TC-VAL-002</w:t>
+            </w:r>
+          </w:p>
+        </w:tc>
+        <w:tc>
+          <w:tcPr>
+            <w:tcW w:type="dxa" w:w="1234"/>
+          </w:tcPr>
+          <w:p>
+            <w:r>
+              <w:t>BIC 8 Zeichen</w:t>
+            </w:r>
+          </w:p>
+        </w:tc>
+        <w:tc>
+          <w:tcPr>
+            <w:tcW w:type="dxa" w:w="1234"/>
+          </w:tcPr>
+          <w:p>
+            <w:r>
+              <w:t>CBPR+</w:t>
+            </w:r>
+          </w:p>
+        </w:tc>
+        <w:tc>
+          <w:tcPr>
+            <w:tcW w:type="dxa" w:w="1234"/>
+          </w:tcPr>
+          <w:p>
+            <w:r>
+              <w:t>OK</w:t>
+            </w:r>
+          </w:p>
+        </w:tc>
+        <w:tc>
+          <w:tcPr>
+            <w:tcW w:type="dxa" w:w="1234"/>
+          </w:tcPr>
+          <w:p>
+            <w:r>
+              <w:t>Alle bestanden</w:t>
+            </w:r>
+          </w:p>
+        </w:tc>
+        <w:tc>
+          <w:tcPr>
+            <w:tcW w:type="dxa" w:w="1234"/>
+          </w:tcPr>
+          <w:p>
+            <w:r>
+              <w:t>Pass</w:t>
+            </w:r>
+          </w:p>
+        </w:tc>
+        <w:tc>
+          <w:tcPr>
+            <w:tcW w:type="dxa" w:w="1234"/>
+          </w:tcPr>
+          <w:p>
+            <w:r>
+              <w:t>BR-GEN-002: 8-stelliger BIC</w:t>
+            </w:r>
+          </w:p>
+        </w:tc>
+      </w:tr>
+      <w:tr>
+        <w:tc>
+          <w:tcPr>
+            <w:tcW w:type="dxa" w:w="1234"/>
+          </w:tcPr>
+          <w:p>
+            <w:r>
+              <w:t>TC-VAL-003</w:t>
+            </w:r>
+          </w:p>
+        </w:tc>
+        <w:tc>
+          <w:tcPr>
+            <w:tcW w:type="dxa" w:w="1234"/>
+          </w:tcPr>
+          <w:p>
+            <w:r>
+              <w:t>BIC 11 Zeichen</w:t>
+            </w:r>
+          </w:p>
+        </w:tc>
+        <w:tc>
+          <w:tcPr>
+            <w:tcW w:type="dxa" w:w="1234"/>
+          </w:tcPr>
+          <w:p>
+            <w:r>
+              <w:t>CBPR+</w:t>
+            </w:r>
+          </w:p>
+        </w:tc>
+        <w:tc>
+          <w:tcPr>
+            <w:tcW w:type="dxa" w:w="1234"/>
+          </w:tcPr>
+          <w:p>
+            <w:r>
+              <w:t>OK</w:t>
+            </w:r>
+          </w:p>
+        </w:tc>
+        <w:tc>
+          <w:tcPr>
+            <w:tcW w:type="dxa" w:w="1234"/>
+          </w:tcPr>
+          <w:p>
+            <w:r>
+              <w:t>Alle bestanden</w:t>
+            </w:r>
+          </w:p>
+        </w:tc>
+        <w:tc>
+          <w:tcPr>
+            <w:tcW w:type="dxa" w:w="1234"/>
+          </w:tcPr>
+          <w:p>
+            <w:r>
+              <w:t>Pass</w:t>
+            </w:r>
+          </w:p>
+        </w:tc>
+        <w:tc>
+          <w:tcPr>
+            <w:tcW w:type="dxa" w:w="1234"/>
+          </w:tcPr>
+          <w:p>
+            <w:r>
+              <w:t>BR-GEN-002: 11-stelliger BIC</w:t>
+            </w:r>
+          </w:p>
+        </w:tc>
+      </w:tr>
+      <w:tr>
+        <w:tc>
+          <w:tcPr>
+            <w:tcW w:type="dxa" w:w="1234"/>
+          </w:tcPr>
+          <w:p>
+            <w:r>
+              <w:t>TC-VAL-004</w:t>
+            </w:r>
+          </w:p>
+        </w:tc>
+        <w:tc>
+          <w:tcPr>
+            <w:tcW w:type="dxa" w:w="1234"/>
+          </w:tcPr>
+          <w:p>
+            <w:r>
+              <w:t>Country-Code DE</w:t>
+            </w:r>
+          </w:p>
+        </w:tc>
+        <w:tc>
+          <w:tcPr>
+            <w:tcW w:type="dxa" w:w="1234"/>
+          </w:tcPr>
+          <w:p>
+            <w:r>
+              <w:t>SEPA</w:t>
+            </w:r>
+          </w:p>
+        </w:tc>
+        <w:tc>
+          <w:tcPr>
+            <w:tcW w:type="dxa" w:w="1234"/>
+          </w:tcPr>
+          <w:p>
+            <w:r>
+              <w:t>OK</w:t>
+            </w:r>
+          </w:p>
+        </w:tc>
+        <w:tc>
+          <w:tcPr>
+            <w:tcW w:type="dxa" w:w="1234"/>
+          </w:tcPr>
+          <w:p>
+            <w:r>
+              <w:t>Alle bestanden</w:t>
+            </w:r>
+          </w:p>
+        </w:tc>
+        <w:tc>
+          <w:tcPr>
+            <w:tcW w:type="dxa" w:w="1234"/>
+          </w:tcPr>
+          <w:p>
+            <w:r>
+              <w:t>Pass</w:t>
+            </w:r>
+          </w:p>
+        </w:tc>
+        <w:tc>
+          <w:tcPr>
+            <w:tcW w:type="dxa" w:w="1234"/>
+          </w:tcPr>
+          <w:p>
+            <w:r>
+              <w:t>BR-GEN-007: gültiger Country-Code DE</w:t>
+            </w:r>
+          </w:p>
+        </w:tc>
+      </w:tr>
+      <w:tr>
+        <w:tc>
+          <w:tcPr>
+            <w:tcW w:type="dxa" w:w="1234"/>
+          </w:tcPr>
+          <w:p>
+            <w:r>
+              <w:t>TC-VAL-005</w:t>
+            </w:r>
+          </w:p>
+        </w:tc>
+        <w:tc>
+          <w:tcPr>
+            <w:tcW w:type="dxa" w:w="1234"/>
+          </w:tcPr>
+          <w:p>
+            <w:r>
+              <w:t>Vollstaendige Creditor-Adresse</w:t>
+            </w:r>
+          </w:p>
+        </w:tc>
+        <w:tc>
+          <w:tcPr>
+            <w:tcW w:type="dxa" w:w="1234"/>
+          </w:tcPr>
+          <w:p>
+            <w:r>
+              <w:t>Domestic-IBAN</w:t>
+            </w:r>
+          </w:p>
+        </w:tc>
+        <w:tc>
+          <w:tcPr>
+            <w:tcW w:type="dxa" w:w="1234"/>
+          </w:tcPr>
+          <w:p>
+            <w:r>
+              <w:t>OK</w:t>
+            </w:r>
+          </w:p>
+        </w:tc>
+        <w:tc>
+          <w:tcPr>
+            <w:tcW w:type="dxa" w:w="1234"/>
+          </w:tcPr>
+          <w:p>
+            <w:r>
+              <w:t>Alle bestanden</w:t>
+            </w:r>
+          </w:p>
+        </w:tc>
+        <w:tc>
+          <w:tcPr>
+            <w:tcW w:type="dxa" w:w="1234"/>
+          </w:tcPr>
+          <w:p>
+            <w:r>
+              <w:t>Pass</w:t>
+            </w:r>
+          </w:p>
+        </w:tc>
+        <w:tc>
+          <w:tcPr>
+            <w:tcW w:type="dxa" w:w="1234"/>
+          </w:tcPr>
+          <w:p>
+            <w:r>
+              <w:t>BR-ADDR-001: TwnNm und Ctry vorhanden</w:t>
+            </w:r>
+          </w:p>
+        </w:tc>
+      </w:tr>
+      <w:tr>
+        <w:tc>
+          <w:tcPr>
+            <w:tcW w:type="dxa" w:w="1234"/>
+          </w:tcPr>
+          <w:p>
+            <w:r>
+              <w:t>TC-VAL-006</w:t>
+            </w:r>
+          </w:p>
+        </w:tc>
+        <w:tc>
+          <w:tcPr>
+            <w:tcW w:type="dxa" w:w="1234"/>
+          </w:tcPr>
+          <w:p>
+            <w:r>
+              <w:t>Creditor-Name 140 Zeichen non-SEPA</w:t>
+            </w:r>
+          </w:p>
+        </w:tc>
+        <w:tc>
+          <w:tcPr>
+            <w:tcW w:type="dxa" w:w="1234"/>
+          </w:tcPr>
+          <w:p>
+            <w:r>
+              <w:t>Domestic-IBAN</w:t>
+            </w:r>
+          </w:p>
+        </w:tc>
+        <w:tc>
+          <w:tcPr>
+            <w:tcW w:type="dxa" w:w="1234"/>
+          </w:tcPr>
+          <w:p>
+            <w:r>
+              <w:t>OK</w:t>
+            </w:r>
+          </w:p>
+        </w:tc>
+        <w:tc>
+          <w:tcPr>
+            <w:tcW w:type="dxa" w:w="1234"/>
+          </w:tcPr>
+          <w:p>
+            <w:r>
+              <w:t>Alle bestanden</w:t>
+            </w:r>
+          </w:p>
+        </w:tc>
+        <w:tc>
+          <w:tcPr>
+            <w:tcW w:type="dxa" w:w="1234"/>
+          </w:tcPr>
+          <w:p>
+            <w:r>
+              <w:t>Pass</w:t>
+            </w:r>
+          </w:p>
+        </w:tc>
+        <w:tc>
+          <w:tcPr>
+            <w:tcW w:type="dxa" w:w="1234"/>
+          </w:tcPr>
+          <w:p>
+            <w:r>
+              <w:t>BR-GEN-006: exakt 140 Zeichen, muss OK sein</w:t>
+            </w:r>
+          </w:p>
+        </w:tc>
+      </w:tr>
+      <w:tr>
+        <w:tc>
+          <w:tcPr>
+            <w:tcW w:type="dxa" w:w="1234"/>
+          </w:tcPr>
+          <w:p>
+            <w:r>
+              <w:t>TC-VAL-007</w:t>
+            </w:r>
+          </w:p>
+        </w:tc>
+        <w:tc>
+          <w:tcPr>
+            <w:tcW w:type="dxa" w:w="1234"/>
+          </w:tcPr>
+          <w:p>
+            <w:r>
+              <w:t>QR-IBAN CH-Laenderkennzeichen</w:t>
+            </w:r>
+          </w:p>
+        </w:tc>
+        <w:tc>
+          <w:tcPr>
+            <w:tcW w:type="dxa" w:w="1234"/>
+          </w:tcPr>
+          <w:p>
+            <w:r>
+              <w:t>Domestic-QR</w:t>
+            </w:r>
+          </w:p>
+        </w:tc>
+        <w:tc>
+          <w:tcPr>
+            <w:tcW w:type="dxa" w:w="1234"/>
+          </w:tcPr>
+          <w:p>
+            <w:r>
+              <w:t>OK</w:t>
+            </w:r>
+          </w:p>
+        </w:tc>
+        <w:tc>
+          <w:tcPr>
+            <w:tcW w:type="dxa" w:w="1234"/>
+          </w:tcPr>
+          <w:p>
+            <w:r>
+              <w:t>Alle bestanden</w:t>
+            </w:r>
+          </w:p>
+        </w:tc>
+        <w:tc>
+          <w:tcPr>
+            <w:tcW w:type="dxa" w:w="1234"/>
+          </w:tcPr>
+          <w:p>
+            <w:r>
+              <w:t>Pass</w:t>
+            </w:r>
+          </w:p>
+        </w:tc>
+        <w:tc>
+          <w:tcPr>
+            <w:tcW w:type="dxa" w:w="1234"/>
+          </w:tcPr>
+          <w:p>
+            <w:r>
+              <w:t>BR-QR-007: CH-IBAN korrekt</w:t>
+            </w:r>
+          </w:p>
+        </w:tc>
+      </w:tr>
+      <w:tr>
+        <w:tc>
+          <w:tcPr>
+            <w:tcW w:type="dxa" w:w="1234"/>
+          </w:tcPr>
+          <w:p>
+            <w:r>
+              <w:t>TC-VAL-008</w:t>
+            </w:r>
+          </w:p>
+        </w:tc>
+        <w:tc>
+          <w:tcPr>
+            <w:tcW w:type="dxa" w:w="1234"/>
+          </w:tcPr>
+          <w:p>
+            <w:r>
+              <w:t>Domestic-IBAN CH-Laenderkennzeichen</w:t>
+            </w:r>
+          </w:p>
+        </w:tc>
+        <w:tc>
+          <w:tcPr>
+            <w:tcW w:type="dxa" w:w="1234"/>
+          </w:tcPr>
+          <w:p>
+            <w:r>
+              <w:t>Domestic-IBAN</w:t>
+            </w:r>
+          </w:p>
+        </w:tc>
+        <w:tc>
+          <w:tcPr>
+            <w:tcW w:type="dxa" w:w="1234"/>
+          </w:tcPr>
+          <w:p>
+            <w:r>
+              <w:t>OK</w:t>
+            </w:r>
+          </w:p>
+        </w:tc>
+        <w:tc>
+          <w:tcPr>
+            <w:tcW w:type="dxa" w:w="1234"/>
+          </w:tcPr>
+          <w:p>
+            <w:r>
+              <w:t>Alle bestanden</w:t>
+            </w:r>
+          </w:p>
+        </w:tc>
+        <w:tc>
+          <w:tcPr>
+            <w:tcW w:type="dxa" w:w="1234"/>
+          </w:tcPr>
+          <w:p>
+            <w:r>
+              <w:t>Pass</w:t>
+            </w:r>
+          </w:p>
+        </w:tc>
+        <w:tc>
+          <w:tcPr>
+            <w:tcW w:type="dxa" w:w="1234"/>
+          </w:tcPr>
+          <w:p>
+            <w:r>
+              <w:t>BR-IBAN-006: CH-IBAN korrekt</w:t>
+            </w:r>
+          </w:p>
+        </w:tc>
+      </w:tr>
+      <w:tr>
+        <w:tc>
+          <w:tcPr>
+            <w:tcW w:type="dxa" w:w="1234"/>
+          </w:tcPr>
+          <w:p>
+            <w:r>
+              <w:t>TC-VAL-009</w:t>
+            </w:r>
+          </w:p>
+        </w:tc>
+        <w:tc>
+          <w:tcPr>
+            <w:tcW w:type="dxa" w:w="1234"/>
+          </w:tcPr>
+          <w:p>
+            <w:r>
+              <w:t>SCOR-Referenz valide</w:t>
+            </w:r>
+          </w:p>
+        </w:tc>
+        <w:tc>
+          <w:tcPr>
+            <w:tcW w:type="dxa" w:w="1234"/>
+          </w:tcPr>
+          <w:p>
+            <w:r>
+              <w:t>Domestic-IBAN</w:t>
+            </w:r>
+          </w:p>
+        </w:tc>
+        <w:tc>
+          <w:tcPr>
+            <w:tcW w:type="dxa" w:w="1234"/>
+          </w:tcPr>
+          <w:p>
+            <w:r>
+              <w:t>OK</w:t>
+            </w:r>
+          </w:p>
+        </w:tc>
+        <w:tc>
+          <w:tcPr>
+            <w:tcW w:type="dxa" w:w="1234"/>
+          </w:tcPr>
+          <w:p>
+            <w:r>
+              <w:t>Alle bestanden</w:t>
+            </w:r>
+          </w:p>
+        </w:tc>
+        <w:tc>
+          <w:tcPr>
+            <w:tcW w:type="dxa" w:w="1234"/>
+          </w:tcPr>
+          <w:p>
+            <w:r>
+              <w:t>Pass</w:t>
+            </w:r>
+          </w:p>
+        </w:tc>
+        <w:tc>
+          <w:tcPr>
+            <w:tcW w:type="dxa" w:w="1234"/>
+          </w:tcPr>
+          <w:p>
+            <w:r>
+              <w:t>BR-REF-V01: generierte SCOR ist valide</w:t>
+            </w:r>
+          </w:p>
+        </w:tc>
+      </w:tr>
+      <w:tr>
+        <w:tc>
+          <w:tcPr>
+            <w:tcW w:type="dxa" w:w="1234"/>
+          </w:tcPr>
+          <w:p>
+            <w:r>
+              <w:t>TC-VAL-010</w:t>
+            </w:r>
+          </w:p>
+        </w:tc>
+        <w:tc>
+          <w:tcPr>
+            <w:tcW w:type="dxa" w:w="1234"/>
+          </w:tcPr>
+          <w:p>
+            <w:r>
+              <w:t>Betrag ganzzahlig</w:t>
+            </w:r>
+          </w:p>
+        </w:tc>
+        <w:tc>
+          <w:tcPr>
+            <w:tcW w:type="dxa" w:w="1234"/>
+          </w:tcPr>
+          <w:p>
+            <w:r>
+              <w:t>SEPA</w:t>
+            </w:r>
+          </w:p>
+        </w:tc>
+        <w:tc>
+          <w:tcPr>
+            <w:tcW w:type="dxa" w:w="1234"/>
+          </w:tcPr>
+          <w:p>
+            <w:r>
+              <w:t>OK</w:t>
+            </w:r>
+          </w:p>
+        </w:tc>
+        <w:tc>
+          <w:tcPr>
+            <w:tcW w:type="dxa" w:w="1234"/>
+          </w:tcPr>
+          <w:p>
+            <w:r>
+              <w:t>Alle bestanden</w:t>
+            </w:r>
+          </w:p>
+        </w:tc>
+        <w:tc>
+          <w:tcPr>
+            <w:tcW w:type="dxa" w:w="1234"/>
+          </w:tcPr>
+          <w:p>
+            <w:r>
+              <w:t>Pass</w:t>
+            </w:r>
+          </w:p>
+        </w:tc>
+        <w:tc>
+          <w:tcPr>
+            <w:tcW w:type="dxa" w:w="1234"/>
+          </w:tcPr>
+          <w:p>
+            <w:r>
+              <w:t>BR-GEN-001: 0 Dezimalstellen ist OK</w:t>
+            </w:r>
+          </w:p>
+        </w:tc>
+      </w:tr>
+      <w:tr>
+        <w:tc>
+          <w:tcPr>
+            <w:tcW w:type="dxa" w:w="1234"/>
+          </w:tcPr>
+          <w:p>
+            <w:r>
+              <w:t>TC-MULTI-007</w:t>
+            </w:r>
+          </w:p>
+        </w:tc>
+        <w:tc>
+          <w:tcPr>
+            <w:tcW w:type="dxa" w:w="1234"/>
+          </w:tcPr>
+          <w:p>
+            <w:r>
+              <w:t>Batch-A: SEPA-Teil</w:t>
+            </w:r>
+          </w:p>
+        </w:tc>
+        <w:tc>
+          <w:tcPr>
+            <w:tcW w:type="dxa" w:w="1234"/>
+          </w:tcPr>
+          <w:p>
+            <w:r>
+              <w:t>SEPA</w:t>
+            </w:r>
+          </w:p>
+        </w:tc>
+        <w:tc>
+          <w:tcPr>
+            <w:tcW w:type="dxa" w:w="1234"/>
+          </w:tcPr>
+          <w:p>
+            <w:r>
+              <w:t>OK</w:t>
+            </w:r>
+          </w:p>
+        </w:tc>
+        <w:tc>
+          <w:tcPr>
+            <w:tcW w:type="dxa" w:w="1234"/>
+          </w:tcPr>
+          <w:p>
+            <w:r>
+              <w:t>Alle bestanden</w:t>
+            </w:r>
+          </w:p>
+        </w:tc>
+        <w:tc>
+          <w:tcPr>
+            <w:tcW w:type="dxa" w:w="1234"/>
+          </w:tcPr>
+          <w:p>
+            <w:r>
+              <w:t>Pass</w:t>
+            </w:r>
+          </w:p>
+        </w:tc>
+        <w:tc>
+          <w:tcPr>
+            <w:tcW w:type="dxa" w:w="1234"/>
+          </w:tcPr>
+          <w:p>
+            <w:r>
+              <w:t>Gruppe BATCH-A, PmtInf 1 von 2</w:t>
+            </w:r>
+          </w:p>
+        </w:tc>
+      </w:tr>
+      <w:tr>
+        <w:tc>
+          <w:tcPr>
+            <w:tcW w:type="dxa" w:w="1234"/>
+          </w:tcPr>
+          <w:p>
+            <w:r>
+              <w:t>TC-MULTI-008</w:t>
+            </w:r>
+          </w:p>
+        </w:tc>
+        <w:tc>
+          <w:tcPr>
+            <w:tcW w:type="dxa" w:w="1234"/>
+          </w:tcPr>
+          <w:p>
+            <w:r>
+              <w:t>Batch-A: Domestic-IBAN-Teil</w:t>
+            </w:r>
+          </w:p>
+        </w:tc>
+        <w:tc>
+          <w:tcPr>
+            <w:tcW w:type="dxa" w:w="1234"/>
+          </w:tcPr>
+          <w:p>
+            <w:r>
+              <w:t>Domestic-IBAN</w:t>
+            </w:r>
+          </w:p>
+        </w:tc>
+        <w:tc>
+          <w:tcPr>
+            <w:tcW w:type="dxa" w:w="1234"/>
+          </w:tcPr>
+          <w:p>
+            <w:r>
+              <w:t>OK</w:t>
+            </w:r>
+          </w:p>
+        </w:tc>
+        <w:tc>
+          <w:tcPr>
+            <w:tcW w:type="dxa" w:w="1234"/>
+          </w:tcPr>
+          <w:p>
+            <w:r>
+              <w:t>Alle bestanden</w:t>
+            </w:r>
+          </w:p>
+        </w:tc>
+        <w:tc>
+          <w:tcPr>
+            <w:tcW w:type="dxa" w:w="1234"/>
+          </w:tcPr>
+          <w:p>
+            <w:r>
+              <w:t>Pass</w:t>
+            </w:r>
+          </w:p>
+        </w:tc>
+        <w:tc>
+          <w:tcPr>
+            <w:tcW w:type="dxa" w:w="1234"/>
+          </w:tcPr>
+          <w:p>
+            <w:r>
+              <w:t>Gruppe BATCH-A, PmtInf 2 von 2</w:t>
+            </w:r>
+          </w:p>
+        </w:tc>
+      </w:tr>
+      <w:tr>
+        <w:tc>
+          <w:tcPr>
+            <w:tcW w:type="dxa" w:w="1234"/>
+          </w:tcPr>
+          <w:p>
+            <w:r>
+              <w:t>TC-MULTI-009</w:t>
+            </w:r>
+          </w:p>
+        </w:tc>
+        <w:tc>
+          <w:tcPr>
+            <w:tcW w:type="dxa" w:w="1234"/>
+          </w:tcPr>
+          <w:p>
+            <w:r>
+              <w:t>Batch-B: CBPR+-Teil</w:t>
+            </w:r>
+          </w:p>
+        </w:tc>
+        <w:tc>
+          <w:tcPr>
+            <w:tcW w:type="dxa" w:w="1234"/>
+          </w:tcPr>
+          <w:p>
+            <w:r>
+              <w:t>CBPR+</w:t>
+            </w:r>
+          </w:p>
+        </w:tc>
+        <w:tc>
+          <w:tcPr>
+            <w:tcW w:type="dxa" w:w="1234"/>
+          </w:tcPr>
+          <w:p>
+            <w:r>
+              <w:t>OK</w:t>
+            </w:r>
+          </w:p>
+        </w:tc>
+        <w:tc>
+          <w:tcPr>
+            <w:tcW w:type="dxa" w:w="1234"/>
+          </w:tcPr>
+          <w:p>
+            <w:r>
+              <w:t>Alle bestanden</w:t>
+            </w:r>
+          </w:p>
+        </w:tc>
+        <w:tc>
+          <w:tcPr>
+            <w:tcW w:type="dxa" w:w="1234"/>
+          </w:tcPr>
+          <w:p>
+            <w:r>
+              <w:t>Pass</w:t>
+            </w:r>
+          </w:p>
+        </w:tc>
+        <w:tc>
+          <w:tcPr>
+            <w:tcW w:type="dxa" w:w="1234"/>
+          </w:tcPr>
+          <w:p>
+            <w:r>
+              <w:t>Gruppe BATCH-B, PmtInf 1 von 2</w:t>
+            </w:r>
+          </w:p>
+        </w:tc>
+      </w:tr>
+      <w:tr>
+        <w:tc>
+          <w:tcPr>
+            <w:tcW w:type="dxa" w:w="1234"/>
+          </w:tcPr>
+          <w:p>
+            <w:r>
               <w:t>TC-MULTI-010</w:t>
             </w:r>
           </w:p>
@@ -1583,6 +4261,582 @@
           <w:p>
             <w:r>
               <w:t>Gruppe BATCH-B, PmtInf 2 von 2</w:t>
+            </w:r>
+          </w:p>
+        </w:tc>
+      </w:tr>
+      <w:tr>
+        <w:tc>
+          <w:tcPr>
+            <w:tcW w:type="dxa" w:w="1234"/>
+          </w:tcPr>
+          <w:p>
+            <w:r>
+              <w:t>TC-BATCH-C-001</w:t>
+            </w:r>
+          </w:p>
+        </w:tc>
+        <w:tc>
+          <w:tcPr>
+            <w:tcW w:type="dxa" w:w="1234"/>
+          </w:tcPr>
+          <w:p>
+            <w:r>
+              <w:t>Batch-C: SEPA-Teil</w:t>
+            </w:r>
+          </w:p>
+        </w:tc>
+        <w:tc>
+          <w:tcPr>
+            <w:tcW w:type="dxa" w:w="1234"/>
+          </w:tcPr>
+          <w:p>
+            <w:r>
+              <w:t>SEPA</w:t>
+            </w:r>
+          </w:p>
+        </w:tc>
+        <w:tc>
+          <w:tcPr>
+            <w:tcW w:type="dxa" w:w="1234"/>
+          </w:tcPr>
+          <w:p>
+            <w:r>
+              <w:t>OK</w:t>
+            </w:r>
+          </w:p>
+        </w:tc>
+        <w:tc>
+          <w:tcPr>
+            <w:tcW w:type="dxa" w:w="1234"/>
+          </w:tcPr>
+          <w:p>
+            <w:r>
+              <w:t>Alle bestanden</w:t>
+            </w:r>
+          </w:p>
+        </w:tc>
+        <w:tc>
+          <w:tcPr>
+            <w:tcW w:type="dxa" w:w="1234"/>
+          </w:tcPr>
+          <w:p>
+            <w:r>
+              <w:t>Pass</w:t>
+            </w:r>
+          </w:p>
+        </w:tc>
+        <w:tc>
+          <w:tcPr>
+            <w:tcW w:type="dxa" w:w="1234"/>
+          </w:tcPr>
+          <w:p>
+            <w:r>
+              <w:t>Gruppe BATCH-C: PmtInf 1 von 3 (SEPA)</w:t>
+            </w:r>
+          </w:p>
+        </w:tc>
+      </w:tr>
+      <w:tr>
+        <w:tc>
+          <w:tcPr>
+            <w:tcW w:type="dxa" w:w="1234"/>
+          </w:tcPr>
+          <w:p>
+            <w:r>
+              <w:t>TC-BATCH-C-002</w:t>
+            </w:r>
+          </w:p>
+        </w:tc>
+        <w:tc>
+          <w:tcPr>
+            <w:tcW w:type="dxa" w:w="1234"/>
+          </w:tcPr>
+          <w:p>
+            <w:r>
+              <w:t>Batch-C: QR-Teil</w:t>
+            </w:r>
+          </w:p>
+        </w:tc>
+        <w:tc>
+          <w:tcPr>
+            <w:tcW w:type="dxa" w:w="1234"/>
+          </w:tcPr>
+          <w:p>
+            <w:r>
+              <w:t>Domestic-QR</w:t>
+            </w:r>
+          </w:p>
+        </w:tc>
+        <w:tc>
+          <w:tcPr>
+            <w:tcW w:type="dxa" w:w="1234"/>
+          </w:tcPr>
+          <w:p>
+            <w:r>
+              <w:t>OK</w:t>
+            </w:r>
+          </w:p>
+        </w:tc>
+        <w:tc>
+          <w:tcPr>
+            <w:tcW w:type="dxa" w:w="1234"/>
+          </w:tcPr>
+          <w:p>
+            <w:r>
+              <w:t>Alle bestanden</w:t>
+            </w:r>
+          </w:p>
+        </w:tc>
+        <w:tc>
+          <w:tcPr>
+            <w:tcW w:type="dxa" w:w="1234"/>
+          </w:tcPr>
+          <w:p>
+            <w:r>
+              <w:t>Pass</w:t>
+            </w:r>
+          </w:p>
+        </w:tc>
+        <w:tc>
+          <w:tcPr>
+            <w:tcW w:type="dxa" w:w="1234"/>
+          </w:tcPr>
+          <w:p>
+            <w:r>
+              <w:t>Gruppe BATCH-C: PmtInf 2 von 3 (QR)</w:t>
+            </w:r>
+          </w:p>
+        </w:tc>
+      </w:tr>
+      <w:tr>
+        <w:tc>
+          <w:tcPr>
+            <w:tcW w:type="dxa" w:w="1234"/>
+          </w:tcPr>
+          <w:p>
+            <w:r>
+              <w:t>TC-BATCH-C-003</w:t>
+            </w:r>
+          </w:p>
+        </w:tc>
+        <w:tc>
+          <w:tcPr>
+            <w:tcW w:type="dxa" w:w="1234"/>
+          </w:tcPr>
+          <w:p>
+            <w:r>
+              <w:t>Batch-C: IBAN-Teil</w:t>
+            </w:r>
+          </w:p>
+        </w:tc>
+        <w:tc>
+          <w:tcPr>
+            <w:tcW w:type="dxa" w:w="1234"/>
+          </w:tcPr>
+          <w:p>
+            <w:r>
+              <w:t>Domestic-IBAN</w:t>
+            </w:r>
+          </w:p>
+        </w:tc>
+        <w:tc>
+          <w:tcPr>
+            <w:tcW w:type="dxa" w:w="1234"/>
+          </w:tcPr>
+          <w:p>
+            <w:r>
+              <w:t>OK</w:t>
+            </w:r>
+          </w:p>
+        </w:tc>
+        <w:tc>
+          <w:tcPr>
+            <w:tcW w:type="dxa" w:w="1234"/>
+          </w:tcPr>
+          <w:p>
+            <w:r>
+              <w:t>Alle bestanden</w:t>
+            </w:r>
+          </w:p>
+        </w:tc>
+        <w:tc>
+          <w:tcPr>
+            <w:tcW w:type="dxa" w:w="1234"/>
+          </w:tcPr>
+          <w:p>
+            <w:r>
+              <w:t>Pass</w:t>
+            </w:r>
+          </w:p>
+        </w:tc>
+        <w:tc>
+          <w:tcPr>
+            <w:tcW w:type="dxa" w:w="1234"/>
+          </w:tcPr>
+          <w:p>
+            <w:r>
+              <w:t>Gruppe BATCH-C: PmtInf 3 von 3 (IBAN)</w:t>
+            </w:r>
+          </w:p>
+        </w:tc>
+      </w:tr>
+      <w:tr>
+        <w:tc>
+          <w:tcPr>
+            <w:tcW w:type="dxa" w:w="1234"/>
+          </w:tcPr>
+          <w:p>
+            <w:r>
+              <w:t>TC-BATCH-D-001</w:t>
+            </w:r>
+          </w:p>
+        </w:tc>
+        <w:tc>
+          <w:tcPr>
+            <w:tcW w:type="dxa" w:w="1234"/>
+          </w:tcPr>
+          <w:p>
+            <w:r>
+              <w:t>Batch-D: SEPA OK-Teil</w:t>
+            </w:r>
+          </w:p>
+        </w:tc>
+        <w:tc>
+          <w:tcPr>
+            <w:tcW w:type="dxa" w:w="1234"/>
+          </w:tcPr>
+          <w:p>
+            <w:r>
+              <w:t>SEPA</w:t>
+            </w:r>
+          </w:p>
+        </w:tc>
+        <w:tc>
+          <w:tcPr>
+            <w:tcW w:type="dxa" w:w="1234"/>
+          </w:tcPr>
+          <w:p>
+            <w:r>
+              <w:t>OK</w:t>
+            </w:r>
+          </w:p>
+        </w:tc>
+        <w:tc>
+          <w:tcPr>
+            <w:tcW w:type="dxa" w:w="1234"/>
+          </w:tcPr>
+          <w:p>
+            <w:r>
+              <w:t>Alle bestanden</w:t>
+            </w:r>
+          </w:p>
+        </w:tc>
+        <w:tc>
+          <w:tcPr>
+            <w:tcW w:type="dxa" w:w="1234"/>
+          </w:tcPr>
+          <w:p>
+            <w:r>
+              <w:t>Pass</w:t>
+            </w:r>
+          </w:p>
+        </w:tc>
+        <w:tc>
+          <w:tcPr>
+            <w:tcW w:type="dxa" w:w="1234"/>
+          </w:tcPr>
+          <w:p>
+            <w:r>
+              <w:t>Gruppe BATCH-D: OK-Anteil</w:t>
+            </w:r>
+          </w:p>
+        </w:tc>
+      </w:tr>
+      <w:tr>
+        <w:tc>
+          <w:tcPr>
+            <w:tcW w:type="dxa" w:w="1234"/>
+          </w:tcPr>
+          <w:p>
+            <w:r>
+              <w:t>TC-BATCH-D-002</w:t>
+            </w:r>
+          </w:p>
+        </w:tc>
+        <w:tc>
+          <w:tcPr>
+            <w:tcW w:type="dxa" w:w="1234"/>
+          </w:tcPr>
+          <w:p>
+            <w:r>
+              <w:t>Batch-D: SEPA NOK-Teil</w:t>
+            </w:r>
+          </w:p>
+        </w:tc>
+        <w:tc>
+          <w:tcPr>
+            <w:tcW w:type="dxa" w:w="1234"/>
+          </w:tcPr>
+          <w:p>
+            <w:r>
+              <w:t>SEPA</w:t>
+            </w:r>
+          </w:p>
+        </w:tc>
+        <w:tc>
+          <w:tcPr>
+            <w:tcW w:type="dxa" w:w="1234"/>
+          </w:tcPr>
+          <w:p>
+            <w:r>
+              <w:t>OK</w:t>
+            </w:r>
+          </w:p>
+        </w:tc>
+        <w:tc>
+          <w:tcPr>
+            <w:tcW w:type="dxa" w:w="1234"/>
+          </w:tcPr>
+          <w:p>
+            <w:r>
+              <w:t>BR-SEPA-001: Währung muss EUR sein</w:t>
+            </w:r>
+          </w:p>
+        </w:tc>
+        <w:tc>
+          <w:tcPr>
+            <w:tcW w:type="dxa" w:w="1234"/>
+          </w:tcPr>
+          <w:p>
+            <w:r>
+              <w:t>Pass</w:t>
+            </w:r>
+          </w:p>
+        </w:tc>
+        <w:tc>
+          <w:tcPr>
+            <w:tcW w:type="dxa" w:w="1234"/>
+          </w:tcPr>
+          <w:p>
+            <w:r>
+              <w:t>Gruppe BATCH-D: NOK-Anteil (Waehrung verletzt)</w:t>
+            </w:r>
+          </w:p>
+        </w:tc>
+      </w:tr>
+      <w:tr>
+        <w:tc>
+          <w:tcPr>
+            <w:tcW w:type="dxa" w:w="1234"/>
+          </w:tcPr>
+          <w:p>
+            <w:r>
+              <w:t>TC-BATCH-E-001</w:t>
+            </w:r>
+          </w:p>
+        </w:tc>
+        <w:tc>
+          <w:tcPr>
+            <w:tcW w:type="dxa" w:w="1234"/>
+          </w:tcPr>
+          <w:p>
+            <w:r>
+              <w:t>Batch-E: SEPA OK</w:t>
+            </w:r>
+          </w:p>
+        </w:tc>
+        <w:tc>
+          <w:tcPr>
+            <w:tcW w:type="dxa" w:w="1234"/>
+          </w:tcPr>
+          <w:p>
+            <w:r>
+              <w:t>SEPA</w:t>
+            </w:r>
+          </w:p>
+        </w:tc>
+        <w:tc>
+          <w:tcPr>
+            <w:tcW w:type="dxa" w:w="1234"/>
+          </w:tcPr>
+          <w:p>
+            <w:r>
+              <w:t>OK</w:t>
+            </w:r>
+          </w:p>
+        </w:tc>
+        <w:tc>
+          <w:tcPr>
+            <w:tcW w:type="dxa" w:w="1234"/>
+          </w:tcPr>
+          <w:p>
+            <w:r>
+              <w:t>Alle bestanden</w:t>
+            </w:r>
+          </w:p>
+        </w:tc>
+        <w:tc>
+          <w:tcPr>
+            <w:tcW w:type="dxa" w:w="1234"/>
+          </w:tcPr>
+          <w:p>
+            <w:r>
+              <w:t>Pass</w:t>
+            </w:r>
+          </w:p>
+        </w:tc>
+        <w:tc>
+          <w:tcPr>
+            <w:tcW w:type="dxa" w:w="1234"/>
+          </w:tcPr>
+          <w:p>
+            <w:r>
+              <w:t>Gruppe BATCH-E: OK-Teil</w:t>
+            </w:r>
+          </w:p>
+        </w:tc>
+      </w:tr>
+      <w:tr>
+        <w:tc>
+          <w:tcPr>
+            <w:tcW w:type="dxa" w:w="1234"/>
+          </w:tcPr>
+          <w:p>
+            <w:r>
+              <w:t>TC-BATCH-E-002</w:t>
+            </w:r>
+          </w:p>
+        </w:tc>
+        <w:tc>
+          <w:tcPr>
+            <w:tcW w:type="dxa" w:w="1234"/>
+          </w:tcPr>
+          <w:p>
+            <w:r>
+              <w:t>Batch-E: QR NOK ohne Ref</w:t>
+            </w:r>
+          </w:p>
+        </w:tc>
+        <w:tc>
+          <w:tcPr>
+            <w:tcW w:type="dxa" w:w="1234"/>
+          </w:tcPr>
+          <w:p>
+            <w:r>
+              <w:t>Domestic-QR</w:t>
+            </w:r>
+          </w:p>
+        </w:tc>
+        <w:tc>
+          <w:tcPr>
+            <w:tcW w:type="dxa" w:w="1234"/>
+          </w:tcPr>
+          <w:p>
+            <w:r>
+              <w:t>OK</w:t>
+            </w:r>
+          </w:p>
+        </w:tc>
+        <w:tc>
+          <w:tcPr>
+            <w:tcW w:type="dxa" w:w="1234"/>
+          </w:tcPr>
+          <w:p>
+            <w:r>
+              <w:t>BR-QR-002: Bei QR-IBAN muss eine QR-Referenz (QRR) vorhanden sein</w:t>
+            </w:r>
+          </w:p>
+        </w:tc>
+        <w:tc>
+          <w:tcPr>
+            <w:tcW w:type="dxa" w:w="1234"/>
+          </w:tcPr>
+          <w:p>
+            <w:r>
+              <w:t>Pass</w:t>
+            </w:r>
+          </w:p>
+        </w:tc>
+        <w:tc>
+          <w:tcPr>
+            <w:tcW w:type="dxa" w:w="1234"/>
+          </w:tcPr>
+          <w:p>
+            <w:r>
+              <w:t>Gruppe BATCH-E: NOK-Teil (BR-QR-002)</w:t>
+            </w:r>
+          </w:p>
+        </w:tc>
+      </w:tr>
+      <w:tr>
+        <w:tc>
+          <w:tcPr>
+            <w:tcW w:type="dxa" w:w="1234"/>
+          </w:tcPr>
+          <w:p>
+            <w:r>
+              <w:t>TC-BATCH-E-003</w:t>
+            </w:r>
+          </w:p>
+        </w:tc>
+        <w:tc>
+          <w:tcPr>
+            <w:tcW w:type="dxa" w:w="1234"/>
+          </w:tcPr>
+          <w:p>
+            <w:r>
+              <w:t>Batch-E: CBPR+ NOK ohne BIC</w:t>
+            </w:r>
+          </w:p>
+        </w:tc>
+        <w:tc>
+          <w:tcPr>
+            <w:tcW w:type="dxa" w:w="1234"/>
+          </w:tcPr>
+          <w:p>
+            <w:r>
+              <w:t>CBPR+</w:t>
+            </w:r>
+          </w:p>
+        </w:tc>
+        <w:tc>
+          <w:tcPr>
+            <w:tcW w:type="dxa" w:w="1234"/>
+          </w:tcPr>
+          <w:p>
+            <w:r>
+              <w:t>OK</w:t>
+            </w:r>
+          </w:p>
+        </w:tc>
+        <w:tc>
+          <w:tcPr>
+            <w:tcW w:type="dxa" w:w="1234"/>
+          </w:tcPr>
+          <w:p>
+            <w:r>
+              <w:t>BR-CBPR-005: Creditor-Agent (BIC) muss angegeben werden</w:t>
+            </w:r>
+          </w:p>
+        </w:tc>
+        <w:tc>
+          <w:tcPr>
+            <w:tcW w:type="dxa" w:w="1234"/>
+          </w:tcPr>
+          <w:p>
+            <w:r>
+              <w:t>Pass</w:t>
+            </w:r>
+          </w:p>
+        </w:tc>
+        <w:tc>
+          <w:tcPr>
+            <w:tcW w:type="dxa" w:w="1234"/>
+          </w:tcPr>
+          <w:p>
+            <w:r>
+              <w:t>Gruppe BATCH-E: NOK-Teil (BR-CBPR-005)</w:t>
             </w:r>
           </w:p>
         </w:tc>

</xml_diff>